<commit_message>
Updated length distributions and manuscript
</commit_message>
<xml_diff>
--- a/manuscript/BlattabactHGTv2_MA_KE-NL_KE.docx
+++ b/manuscript/BlattabactHGTv2_MA_KE-NL_KE.docx
@@ -1,6 +1,6 @@
 
 <file path=word/document.xml><?xml version="1.0" encoding="utf-8"?>
-<w:document xmlns:wpc="http://schemas.microsoft.com/office/word/2010/wordprocessingCanvas" xmlns:cx="http://schemas.microsoft.com/office/drawing/2014/chartex" xmlns:cx1="http://schemas.microsoft.com/office/drawing/2015/9/8/chartex" xmlns:cx2="http://schemas.microsoft.com/office/drawing/2015/10/21/chartex" xmlns:cx3="http://schemas.microsoft.com/office/drawing/2016/5/9/chartex" xmlns:cx4="http://schemas.microsoft.com/office/drawing/2016/5/10/chartex" xmlns:cx5="http://schemas.microsoft.com/office/drawing/2016/5/11/chartex" xmlns:cx6="http://schemas.microsoft.com/office/drawing/2016/5/12/chartex" xmlns:cx7="http://schemas.microsoft.com/office/drawing/2016/5/13/chartex" xmlns:cx8="http://schemas.microsoft.com/office/drawing/2016/5/14/chartex" xmlns:mc="http://schemas.openxmlformats.org/markup-compatibility/2006" xmlns:aink="http://schemas.microsoft.com/office/drawing/2016/ink" xmlns:am3d="http://schemas.microsoft.com/office/drawing/2017/model3d" xmlns:o="urn:schemas-microsoft-com:office:office" xmlns:r="http://schemas.openxmlformats.org/officeDocument/2006/relationships" xmlns:m="http://schemas.openxmlformats.org/officeDocument/2006/math" xmlns:v="urn:schemas-microsoft-com:vml" xmlns:wp14="http://schemas.microsoft.com/office/word/2010/wordprocessingDrawing" xmlns:wp="http://schemas.openxmlformats.org/drawingml/2006/wordprocessingDrawing" xmlns:w10="urn:schemas-microsoft-com:office:word" xmlns:w="http://schemas.openxmlformats.org/wordprocessingml/2006/main" xmlns:w14="http://schemas.microsoft.com/office/word/2010/wordml" xmlns:w15="http://schemas.microsoft.com/office/word/2012/wordml" xmlns:w16cid="http://schemas.microsoft.com/office/word/2016/wordml/cid" xmlns:w16se="http://schemas.microsoft.com/office/word/2015/wordml/symex" xmlns:wpg="http://schemas.microsoft.com/office/word/2010/wordprocessingGroup" xmlns:wpi="http://schemas.microsoft.com/office/word/2010/wordprocessingInk" xmlns:wne="http://schemas.microsoft.com/office/word/2006/wordml" xmlns:wps="http://schemas.microsoft.com/office/word/2010/wordprocessingShape" mc:Ignorable="w14 w15 w16se w16cid wp14">
+<w:document xmlns:wpc="http://schemas.microsoft.com/office/word/2010/wordprocessingCanvas" xmlns:cx="http://schemas.microsoft.com/office/drawing/2014/chartex" xmlns:cx1="http://schemas.microsoft.com/office/drawing/2015/9/8/chartex" xmlns:cx2="http://schemas.microsoft.com/office/drawing/2015/10/21/chartex" xmlns:cx3="http://schemas.microsoft.com/office/drawing/2016/5/9/chartex" xmlns:cx4="http://schemas.microsoft.com/office/drawing/2016/5/10/chartex" xmlns:cx5="http://schemas.microsoft.com/office/drawing/2016/5/11/chartex" xmlns:cx6="http://schemas.microsoft.com/office/drawing/2016/5/12/chartex" xmlns:cx7="http://schemas.microsoft.com/office/drawing/2016/5/13/chartex" xmlns:cx8="http://schemas.microsoft.com/office/drawing/2016/5/14/chartex" xmlns:mc="http://schemas.openxmlformats.org/markup-compatibility/2006" xmlns:aink="http://schemas.microsoft.com/office/drawing/2016/ink" xmlns:am3d="http://schemas.microsoft.com/office/drawing/2017/model3d" xmlns:o="urn:schemas-microsoft-com:office:office" xmlns:oel="http://schemas.microsoft.com/office/2019/extlst" xmlns:r="http://schemas.openxmlformats.org/officeDocument/2006/relationships" xmlns:m="http://schemas.openxmlformats.org/officeDocument/2006/math" xmlns:v="urn:schemas-microsoft-com:vml" xmlns:wp14="http://schemas.microsoft.com/office/word/2010/wordprocessingDrawing" xmlns:wp="http://schemas.openxmlformats.org/drawingml/2006/wordprocessingDrawing" xmlns:w10="urn:schemas-microsoft-com:office:word" xmlns:w="http://schemas.openxmlformats.org/wordprocessingml/2006/main" xmlns:w14="http://schemas.microsoft.com/office/word/2010/wordml" xmlns:w15="http://schemas.microsoft.com/office/word/2012/wordml" xmlns:w16cex="http://schemas.microsoft.com/office/word/2018/wordml/cex" xmlns:w16cid="http://schemas.microsoft.com/office/word/2016/wordml/cid" xmlns:w16="http://schemas.microsoft.com/office/word/2018/wordml" xmlns:w16du="http://schemas.microsoft.com/office/word/2023/wordml/word16du" xmlns:w16sdtdh="http://schemas.microsoft.com/office/word/2020/wordml/sdtdatahash" xmlns:w16sdtfl="http://schemas.microsoft.com/office/word/2024/wordml/sdtformatlock" xmlns:w16se="http://schemas.microsoft.com/office/word/2015/wordml/symex" xmlns:wpg="http://schemas.microsoft.com/office/word/2010/wordprocessingGroup" xmlns:wpi="http://schemas.microsoft.com/office/word/2010/wordprocessingInk" xmlns:wne="http://schemas.microsoft.com/office/word/2006/wordml" xmlns:wps="http://schemas.microsoft.com/office/word/2010/wordprocessingShape" mc:Ignorable="w14 w15 w16se w16cid w16 w16cex w16sdtdh w16sdtfl w16du wp14">
   <w:body>
     <w:p>
       <w:pPr>
@@ -83,13 +83,27 @@
           <w:rFonts w:asciiTheme="majorHAnsi" w:hAnsiTheme="majorHAnsi"/>
           <w:bCs/>
         </w:rPr>
-        <w:t>Kyle Ewart</w:t>
+        <w:t xml:space="preserve">Kyle </w:t>
       </w:r>
       <w:r>
         <w:rPr>
           <w:rFonts w:asciiTheme="majorHAnsi" w:hAnsiTheme="majorHAnsi"/>
           <w:bCs/>
         </w:rPr>
+        <w:t xml:space="preserve">M. </w:t>
+      </w:r>
+      <w:r>
+        <w:rPr>
+          <w:rFonts w:asciiTheme="majorHAnsi" w:hAnsiTheme="majorHAnsi"/>
+          <w:bCs/>
+        </w:rPr>
+        <w:t>Ewart</w:t>
+      </w:r>
+      <w:r>
+        <w:rPr>
+          <w:rFonts w:asciiTheme="majorHAnsi" w:hAnsiTheme="majorHAnsi"/>
+          <w:bCs/>
+        </w:rPr>
         <w:t>*</w:t>
       </w:r>
       <w:r>
@@ -187,7 +201,6 @@
         </w:rPr>
         <w:t xml:space="preserve">Oscar Lo Lu, </w:t>
       </w:r>
-      <w:proofErr w:type="spellStart"/>
       <w:r>
         <w:rPr>
           <w:rFonts w:asciiTheme="majorHAnsi" w:hAnsiTheme="majorHAnsi"/>
@@ -195,96 +208,54 @@
         </w:rPr>
         <w:t>Jil</w:t>
       </w:r>
-      <w:proofErr w:type="spellEnd"/>
       <w:r>
         <w:rPr>
           <w:rFonts w:asciiTheme="majorHAnsi" w:hAnsiTheme="majorHAnsi"/>
           <w:bCs/>
         </w:rPr>
-        <w:t xml:space="preserve"> </w:t>
-      </w:r>
-      <w:proofErr w:type="spellStart"/>
+        <w:t xml:space="preserve"> Helbling</w:t>
+      </w:r>
       <w:r>
         <w:rPr>
           <w:rFonts w:asciiTheme="majorHAnsi" w:hAnsiTheme="majorHAnsi"/>
           <w:bCs/>
         </w:rPr>
-        <w:t>Helbling</w:t>
-      </w:r>
-      <w:proofErr w:type="spellEnd"/>
+        <w:t xml:space="preserve">, </w:t>
+      </w:r>
       <w:r>
         <w:rPr>
           <w:rFonts w:asciiTheme="majorHAnsi" w:hAnsiTheme="majorHAnsi"/>
           <w:bCs/>
         </w:rPr>
-        <w:t xml:space="preserve">, </w:t>
+        <w:t xml:space="preserve">Maya Moral, </w:t>
       </w:r>
       <w:r>
         <w:rPr>
           <w:rFonts w:asciiTheme="majorHAnsi" w:hAnsiTheme="majorHAnsi"/>
           <w:bCs/>
         </w:rPr>
-        <w:t xml:space="preserve">Maya Moral, </w:t>
+        <w:t xml:space="preserve">Kiyoto Maekawa, </w:t>
       </w:r>
       <w:r>
         <w:rPr>
           <w:rFonts w:asciiTheme="majorHAnsi" w:hAnsiTheme="majorHAnsi"/>
           <w:bCs/>
         </w:rPr>
-        <w:t xml:space="preserve">Kiyoto Maekawa, </w:t>
+        <w:t xml:space="preserve">Harley Rose, </w:t>
       </w:r>
       <w:r>
         <w:rPr>
           <w:rFonts w:asciiTheme="majorHAnsi" w:hAnsiTheme="majorHAnsi"/>
           <w:bCs/>
         </w:rPr>
-        <w:t xml:space="preserve">Harley Rose, </w:t>
+        <w:t xml:space="preserve">Aaron Jex, </w:t>
       </w:r>
       <w:r>
         <w:rPr>
           <w:rFonts w:asciiTheme="majorHAnsi" w:hAnsiTheme="majorHAnsi"/>
           <w:bCs/>
         </w:rPr>
-        <w:t xml:space="preserve">Aaron </w:t>
-      </w:r>
-      <w:proofErr w:type="spellStart"/>
-      <w:r>
-        <w:rPr>
-          <w:rFonts w:asciiTheme="majorHAnsi" w:hAnsiTheme="majorHAnsi"/>
-          <w:bCs/>
-        </w:rPr>
-        <w:t>Jex</w:t>
-      </w:r>
-      <w:proofErr w:type="spellEnd"/>
-      <w:r>
-        <w:rPr>
-          <w:rFonts w:asciiTheme="majorHAnsi" w:hAnsiTheme="majorHAnsi"/>
-          <w:bCs/>
-        </w:rPr>
-        <w:t xml:space="preserve">, </w:t>
-      </w:r>
-      <w:r>
-        <w:rPr>
-          <w:rFonts w:asciiTheme="majorHAnsi" w:hAnsiTheme="majorHAnsi"/>
-          <w:bCs/>
-        </w:rPr>
-        <w:t xml:space="preserve">Simon </w:t>
-      </w:r>
-      <w:proofErr w:type="spellStart"/>
-      <w:r>
-        <w:rPr>
-          <w:rFonts w:asciiTheme="majorHAnsi" w:hAnsiTheme="majorHAnsi"/>
-          <w:bCs/>
-        </w:rPr>
-        <w:t>Ho</w:t>
-      </w:r>
-      <w:proofErr w:type="spellEnd"/>
-      <w:r>
-        <w:rPr>
-          <w:rFonts w:asciiTheme="majorHAnsi" w:hAnsiTheme="majorHAnsi"/>
-          <w:bCs/>
-        </w:rPr>
-        <w:t xml:space="preserve">, </w:t>
+        <w:t xml:space="preserve">Simon Ho, </w:t>
       </w:r>
       <w:r>
         <w:rPr>
@@ -1465,14 +1436,12 @@
         </w:rPr>
         <w:t xml:space="preserve"> (</w:t>
       </w:r>
-      <w:proofErr w:type="spellStart"/>
       <w:r>
         <w:rPr>
           <w:rFonts w:asciiTheme="majorHAnsi" w:hAnsiTheme="majorHAnsi" w:cs="Arial"/>
         </w:rPr>
         <w:t>Sacchi</w:t>
       </w:r>
-      <w:proofErr w:type="spellEnd"/>
       <w:r>
         <w:rPr>
           <w:rFonts w:asciiTheme="majorHAnsi" w:hAnsiTheme="majorHAnsi" w:cs="Arial"/>
@@ -2153,14 +2122,7 @@
           <w:rFonts w:asciiTheme="majorHAnsi" w:hAnsiTheme="majorHAnsi" w:cs="Arial"/>
           <w:color w:val="000000" w:themeColor="text1"/>
         </w:rPr>
-        <w:t xml:space="preserve">40,484 </w:t>
-      </w:r>
-      <w:r>
-        <w:rPr>
-          <w:rFonts w:asciiTheme="majorHAnsi" w:hAnsiTheme="majorHAnsi" w:cs="Arial"/>
-          <w:color w:val="000000" w:themeColor="text1"/>
-        </w:rPr>
-        <w:t>unique</w:t>
+        <w:t>40,484 unique</w:t>
       </w:r>
       <w:r>
         <w:rPr>
@@ -2273,6 +2235,27 @@
           <w:rFonts w:asciiTheme="majorHAnsi" w:hAnsiTheme="majorHAnsi" w:cs="Arial"/>
           <w:color w:val="000000" w:themeColor="text1"/>
         </w:rPr>
+        <w:t xml:space="preserve">; </w:t>
+      </w:r>
+      <w:r>
+        <w:rPr>
+          <w:rFonts w:asciiTheme="majorHAnsi" w:hAnsiTheme="majorHAnsi" w:cs="Arial"/>
+          <w:color w:val="000000" w:themeColor="text1"/>
+        </w:rPr>
+        <w:t>Fig. 1</w:t>
+      </w:r>
+      <w:r>
+        <w:rPr>
+          <w:rFonts w:asciiTheme="majorHAnsi" w:hAnsiTheme="majorHAnsi" w:cs="Arial"/>
+          <w:color w:val="000000" w:themeColor="text1"/>
+        </w:rPr>
+        <w:t>A</w:t>
+      </w:r>
+      <w:r>
+        <w:rPr>
+          <w:rFonts w:asciiTheme="majorHAnsi" w:hAnsiTheme="majorHAnsi" w:cs="Arial"/>
+          <w:color w:val="000000" w:themeColor="text1"/>
+        </w:rPr>
         <w:t>)</w:t>
       </w:r>
       <w:r>
@@ -2280,274 +2263,276 @@
           <w:rFonts w:asciiTheme="majorHAnsi" w:hAnsiTheme="majorHAnsi" w:cs="Arial"/>
           <w:color w:val="000000" w:themeColor="text1"/>
         </w:rPr>
-        <w:t xml:space="preserve">, ranging </w:t>
-      </w:r>
-      <w:r>
-        <w:rPr>
-          <w:rFonts w:asciiTheme="majorHAnsi" w:hAnsiTheme="majorHAnsi" w:cs="Arial"/>
-        </w:rPr>
-        <w:t xml:space="preserve">in size from </w:t>
-      </w:r>
+        <w:t xml:space="preserve">, ranging in size from </w:t>
+      </w:r>
+      <w:r>
+        <w:rPr>
+          <w:rFonts w:asciiTheme="majorHAnsi" w:hAnsiTheme="majorHAnsi" w:cs="Arial"/>
+          <w:color w:val="000000" w:themeColor="text1"/>
+        </w:rPr>
+        <w:t>50</w:t>
+      </w:r>
+      <w:r>
+        <w:rPr>
+          <w:rFonts w:asciiTheme="majorHAnsi" w:hAnsiTheme="majorHAnsi" w:cs="Arial"/>
+          <w:color w:val="000000" w:themeColor="text1"/>
+        </w:rPr>
+        <w:t>-</w:t>
+      </w:r>
+      <w:r>
+        <w:rPr>
+          <w:rFonts w:asciiTheme="majorHAnsi" w:hAnsiTheme="majorHAnsi" w:cs="Arial"/>
+          <w:color w:val="000000" w:themeColor="text1"/>
+        </w:rPr>
+        <w:t>5743</w:t>
+      </w:r>
+      <w:r>
+        <w:rPr>
+          <w:rFonts w:asciiTheme="majorHAnsi" w:hAnsiTheme="majorHAnsi" w:cs="Arial"/>
+          <w:color w:val="000000" w:themeColor="text1"/>
+        </w:rPr>
+        <w:t xml:space="preserve"> bp, with a median size of </w:t>
+      </w:r>
+      <w:r>
+        <w:rPr>
+          <w:rFonts w:asciiTheme="majorHAnsi" w:hAnsiTheme="majorHAnsi" w:cs="Arial"/>
+          <w:color w:val="000000" w:themeColor="text1"/>
+        </w:rPr>
+        <w:t>161</w:t>
+      </w:r>
+      <w:r>
+        <w:rPr>
+          <w:rFonts w:asciiTheme="majorHAnsi" w:hAnsiTheme="majorHAnsi" w:cs="Arial"/>
+          <w:color w:val="000000" w:themeColor="text1"/>
+        </w:rPr>
+        <w:t xml:space="preserve"> bp</w:t>
+      </w:r>
+      <w:r>
+        <w:rPr>
+          <w:rFonts w:asciiTheme="majorHAnsi" w:hAnsiTheme="majorHAnsi" w:cs="Arial"/>
+          <w:color w:val="000000" w:themeColor="text1"/>
+        </w:rPr>
+        <w:t xml:space="preserve"> (Fig. 1</w:t>
+      </w:r>
+      <w:r>
+        <w:rPr>
+          <w:rFonts w:asciiTheme="majorHAnsi" w:hAnsiTheme="majorHAnsi" w:cs="Arial"/>
+          <w:color w:val="000000" w:themeColor="text1"/>
+        </w:rPr>
+        <w:t>B</w:t>
+      </w:r>
+      <w:r>
+        <w:rPr>
+          <w:rFonts w:asciiTheme="majorHAnsi" w:hAnsiTheme="majorHAnsi" w:cs="Arial"/>
+          <w:color w:val="000000" w:themeColor="text1"/>
+        </w:rPr>
+        <w:t>)</w:t>
+      </w:r>
+      <w:r>
+        <w:rPr>
+          <w:rFonts w:asciiTheme="majorHAnsi" w:hAnsiTheme="majorHAnsi" w:cs="Arial"/>
+          <w:color w:val="000000" w:themeColor="text1"/>
+        </w:rPr>
+        <w:t>.</w:t>
+      </w:r>
+      <w:r>
+        <w:rPr>
+          <w:rFonts w:asciiTheme="majorHAnsi" w:hAnsiTheme="majorHAnsi" w:cs="Arial"/>
+          <w:color w:val="000000" w:themeColor="text1"/>
+        </w:rPr>
+        <w:t xml:space="preserve"> </w:t>
+      </w:r>
+      <w:r>
+        <w:rPr>
+          <w:rFonts w:asciiTheme="majorHAnsi" w:hAnsiTheme="majorHAnsi" w:cs="Arial"/>
+        </w:rPr>
+        <w:t>Most of the genomes in which we detected large numbers</w:t>
+      </w:r>
+      <w:r>
+        <w:rPr>
+          <w:rFonts w:asciiTheme="majorHAnsi" w:hAnsiTheme="majorHAnsi" w:cs="Arial"/>
+        </w:rPr>
+        <w:t xml:space="preserve"> (i.e. several thousand)</w:t>
+      </w:r>
+      <w:r>
+        <w:rPr>
+          <w:rFonts w:asciiTheme="majorHAnsi" w:hAnsiTheme="majorHAnsi" w:cs="Arial"/>
+        </w:rPr>
+        <w:t xml:space="preserve"> </w:t>
+      </w:r>
+      <w:r>
+        <w:rPr>
+          <w:rFonts w:asciiTheme="majorHAnsi" w:hAnsiTheme="majorHAnsi" w:cs="Arial"/>
+        </w:rPr>
+        <w:t xml:space="preserve">of </w:t>
+      </w:r>
+      <w:proofErr w:type="spellStart"/>
+      <w:r>
+        <w:rPr>
+          <w:rFonts w:asciiTheme="majorHAnsi" w:hAnsiTheme="majorHAnsi" w:cs="Arial"/>
+          <w:i/>
+          <w:iCs/>
+        </w:rPr>
+        <w:t>Blattabacterium</w:t>
+      </w:r>
+      <w:proofErr w:type="spellEnd"/>
+      <w:r>
+        <w:rPr>
+          <w:rFonts w:asciiTheme="majorHAnsi" w:hAnsiTheme="majorHAnsi" w:cs="Arial"/>
+          <w:i/>
+          <w:iCs/>
+        </w:rPr>
+        <w:t xml:space="preserve"> </w:t>
+      </w:r>
+      <w:r>
+        <w:rPr>
+          <w:rFonts w:asciiTheme="majorHAnsi" w:hAnsiTheme="majorHAnsi" w:cs="Arial"/>
+        </w:rPr>
+        <w:t>inserts were sequenced using ONT long-read technolog</w:t>
+      </w:r>
+      <w:r>
+        <w:rPr>
+          <w:rFonts w:asciiTheme="majorHAnsi" w:hAnsiTheme="majorHAnsi" w:cs="Arial"/>
+        </w:rPr>
+        <w:t>y,</w:t>
+      </w:r>
+      <w:r>
+        <w:rPr>
+          <w:rFonts w:asciiTheme="majorHAnsi" w:hAnsiTheme="majorHAnsi" w:cs="Arial"/>
+        </w:rPr>
+        <w:t xml:space="preserve"> with N50s </w:t>
+      </w:r>
+      <w:r>
+        <w:rPr>
+          <w:rFonts w:asciiTheme="majorHAnsi" w:hAnsiTheme="majorHAnsi" w:cs="Arial"/>
+        </w:rPr>
+        <w:t>860</w:t>
+      </w:r>
+      <w:r>
+        <w:rPr>
+          <w:rFonts w:asciiTheme="majorHAnsi" w:hAnsiTheme="majorHAnsi" w:cs="Arial"/>
+        </w:rPr>
+        <w:t>-</w:t>
+      </w:r>
+      <w:r>
+        <w:rPr>
+          <w:rFonts w:asciiTheme="majorHAnsi" w:hAnsiTheme="majorHAnsi" w:cs="Arial"/>
+        </w:rPr>
+        <w:t>5330</w:t>
+      </w:r>
+      <w:r>
+        <w:rPr>
+          <w:rFonts w:asciiTheme="majorHAnsi" w:hAnsiTheme="majorHAnsi" w:cs="Arial"/>
+        </w:rPr>
+        <w:t xml:space="preserve"> kb</w:t>
+      </w:r>
+      <w:r>
+        <w:rPr>
+          <w:rFonts w:asciiTheme="majorHAnsi" w:hAnsiTheme="majorHAnsi" w:cs="Arial"/>
+        </w:rPr>
+        <w:t xml:space="preserve">, </w:t>
+      </w:r>
+      <w:r>
+        <w:rPr>
+          <w:rFonts w:asciiTheme="majorHAnsi" w:hAnsiTheme="majorHAnsi" w:cs="Arial"/>
+        </w:rPr>
+        <w:t xml:space="preserve">and </w:t>
+      </w:r>
+      <w:r>
+        <w:rPr>
+          <w:rFonts w:asciiTheme="majorHAnsi" w:hAnsiTheme="majorHAnsi" w:cs="Arial"/>
+        </w:rPr>
+        <w:t>95.2-99.5</w:t>
+      </w:r>
+      <w:r>
+        <w:rPr>
+          <w:rFonts w:asciiTheme="majorHAnsi" w:hAnsiTheme="majorHAnsi" w:cs="Arial"/>
+        </w:rPr>
+        <w:t xml:space="preserve">% complete </w:t>
+      </w:r>
+      <w:r>
+        <w:rPr>
+          <w:rFonts w:asciiTheme="majorHAnsi" w:hAnsiTheme="majorHAnsi" w:cs="Arial"/>
+          <w:color w:val="000000" w:themeColor="text1"/>
+        </w:rPr>
+        <w:t>BUSCO</w:t>
+      </w:r>
+      <w:r>
+        <w:rPr>
+          <w:rFonts w:asciiTheme="majorHAnsi" w:hAnsiTheme="majorHAnsi" w:cs="Arial"/>
+          <w:color w:val="000000" w:themeColor="text1"/>
+        </w:rPr>
+        <w:t>s</w:t>
+      </w:r>
+      <w:r>
+        <w:rPr>
+          <w:rFonts w:asciiTheme="majorHAnsi" w:hAnsiTheme="majorHAnsi" w:cs="Arial"/>
+          <w:color w:val="000000" w:themeColor="text1"/>
+        </w:rPr>
+        <w:t xml:space="preserve"> </w:t>
+      </w:r>
+      <w:r>
+        <w:rPr>
+          <w:rFonts w:asciiTheme="majorHAnsi" w:hAnsiTheme="majorHAnsi" w:cs="Arial"/>
+          <w:color w:val="000000" w:themeColor="text1"/>
+        </w:rPr>
+        <w:t>(Table S</w:t>
+      </w:r>
+      <w:r>
+        <w:rPr>
+          <w:rFonts w:asciiTheme="majorHAnsi" w:hAnsiTheme="majorHAnsi" w:cs="Arial"/>
+          <w:color w:val="000000" w:themeColor="text1"/>
+        </w:rPr>
+        <w:t>2</w:t>
+      </w:r>
+      <w:r>
+        <w:rPr>
+          <w:rFonts w:asciiTheme="majorHAnsi" w:hAnsiTheme="majorHAnsi" w:cs="Arial"/>
+          <w:color w:val="000000" w:themeColor="text1"/>
+        </w:rPr>
+        <w:t>)</w:t>
+      </w:r>
+      <w:r>
+        <w:rPr>
+          <w:rFonts w:asciiTheme="majorHAnsi" w:hAnsiTheme="majorHAnsi" w:cs="Arial"/>
+          <w:color w:val="000000" w:themeColor="text1"/>
+        </w:rPr>
+        <w:t xml:space="preserve">. </w:t>
+      </w:r>
+      <w:commentRangeStart w:id="2"/>
+      <w:r>
+        <w:rPr>
+          <w:rFonts w:asciiTheme="majorHAnsi" w:hAnsiTheme="majorHAnsi" w:cs="Arial"/>
+        </w:rPr>
+        <w:t>Most inserts (#%)</w:t>
+      </w:r>
+      <w:commentRangeEnd w:id="2"/>
+      <w:r>
+        <w:rPr>
+          <w:rStyle w:val="CommentReference"/>
+        </w:rPr>
+        <w:commentReference w:id="2"/>
+      </w:r>
+      <w:r>
+        <w:rPr>
+          <w:rFonts w:asciiTheme="majorHAnsi" w:hAnsiTheme="majorHAnsi" w:cs="Arial"/>
+        </w:rPr>
+        <w:t xml:space="preserve"> were found within long reads, flanked either side by cockroach host sequence (Figure 1). Further, the long-read sequencing depth of these insert regions was typically &gt;</w:t>
+      </w:r>
+      <w:commentRangeStart w:id="3"/>
       <w:r>
         <w:rPr>
           <w:rFonts w:asciiTheme="majorHAnsi" w:hAnsiTheme="majorHAnsi" w:cs="Arial"/>
           <w:color w:val="FF0000"/>
         </w:rPr>
-        <w:t>X</w:t>
-      </w:r>
-      <w:r>
-        <w:rPr>
-          <w:rFonts w:asciiTheme="majorHAnsi" w:hAnsiTheme="majorHAnsi" w:cs="Arial"/>
-          <w:color w:val="FF0000"/>
-        </w:rPr>
-        <w:t>X</w:t>
-      </w:r>
-      <w:r>
-        <w:rPr>
-          <w:rFonts w:asciiTheme="majorHAnsi" w:hAnsiTheme="majorHAnsi" w:cs="Arial"/>
-          <w:color w:val="FF0000"/>
-        </w:rPr>
-        <w:t>-</w:t>
-      </w:r>
-      <w:r>
-        <w:rPr>
-          <w:rFonts w:asciiTheme="majorHAnsi" w:hAnsiTheme="majorHAnsi" w:cs="Arial"/>
-          <w:color w:val="FF0000"/>
-        </w:rPr>
-        <w:t>XX</w:t>
-      </w:r>
-      <w:r>
-        <w:rPr>
-          <w:rFonts w:asciiTheme="majorHAnsi" w:hAnsiTheme="majorHAnsi" w:cs="Arial"/>
-          <w:color w:val="FF0000"/>
-        </w:rPr>
-        <w:t xml:space="preserve"> </w:t>
-      </w:r>
-      <w:r>
-        <w:rPr>
-          <w:rFonts w:asciiTheme="majorHAnsi" w:hAnsiTheme="majorHAnsi" w:cs="Arial"/>
-        </w:rPr>
-        <w:t xml:space="preserve">bp, with a median size of </w:t>
-      </w:r>
-      <w:r>
-        <w:rPr>
-          <w:rFonts w:asciiTheme="majorHAnsi" w:hAnsiTheme="majorHAnsi" w:cs="Arial"/>
-          <w:color w:val="FF0000"/>
-        </w:rPr>
-        <w:t>X</w:t>
-      </w:r>
-      <w:r>
-        <w:rPr>
-          <w:rFonts w:asciiTheme="majorHAnsi" w:hAnsiTheme="majorHAnsi" w:cs="Arial"/>
-          <w:color w:val="FF0000"/>
-        </w:rPr>
-        <w:t>X</w:t>
-      </w:r>
-      <w:r>
-        <w:rPr>
-          <w:rFonts w:asciiTheme="majorHAnsi" w:hAnsiTheme="majorHAnsi" w:cs="Arial"/>
-        </w:rPr>
-        <w:t xml:space="preserve"> bp</w:t>
-      </w:r>
-      <w:r>
-        <w:rPr>
-          <w:rFonts w:asciiTheme="majorHAnsi" w:hAnsiTheme="majorHAnsi" w:cs="Arial"/>
-        </w:rPr>
-        <w:t xml:space="preserve"> (Fig. 1)</w:t>
-      </w:r>
-      <w:r>
-        <w:rPr>
-          <w:rFonts w:asciiTheme="majorHAnsi" w:hAnsiTheme="majorHAnsi" w:cs="Arial"/>
-        </w:rPr>
-        <w:t>.</w:t>
-      </w:r>
-      <w:r>
-        <w:rPr>
-          <w:rFonts w:asciiTheme="majorHAnsi" w:hAnsiTheme="majorHAnsi" w:cs="Arial"/>
-        </w:rPr>
-        <w:t xml:space="preserve"> </w:t>
-      </w:r>
-      <w:r>
-        <w:rPr>
-          <w:rFonts w:asciiTheme="majorHAnsi" w:hAnsiTheme="majorHAnsi" w:cs="Arial"/>
-        </w:rPr>
-        <w:t>Most of the genomes in which we detected large numbers</w:t>
-      </w:r>
-      <w:r>
-        <w:rPr>
-          <w:rFonts w:asciiTheme="majorHAnsi" w:hAnsiTheme="majorHAnsi" w:cs="Arial"/>
-        </w:rPr>
-        <w:t xml:space="preserve"> (i.e. several thousand)</w:t>
-      </w:r>
-      <w:r>
-        <w:rPr>
-          <w:rFonts w:asciiTheme="majorHAnsi" w:hAnsiTheme="majorHAnsi" w:cs="Arial"/>
-        </w:rPr>
-        <w:t xml:space="preserve"> </w:t>
-      </w:r>
-      <w:r>
-        <w:rPr>
-          <w:rFonts w:asciiTheme="majorHAnsi" w:hAnsiTheme="majorHAnsi" w:cs="Arial"/>
-        </w:rPr>
-        <w:t xml:space="preserve">of </w:t>
-      </w:r>
-      <w:proofErr w:type="spellStart"/>
-      <w:r>
-        <w:rPr>
-          <w:rFonts w:asciiTheme="majorHAnsi" w:hAnsiTheme="majorHAnsi" w:cs="Arial"/>
-          <w:i/>
-          <w:iCs/>
-        </w:rPr>
-        <w:t>Blattabacterium</w:t>
-      </w:r>
-      <w:proofErr w:type="spellEnd"/>
-      <w:r>
-        <w:rPr>
-          <w:rFonts w:asciiTheme="majorHAnsi" w:hAnsiTheme="majorHAnsi" w:cs="Arial"/>
-          <w:i/>
-          <w:iCs/>
-        </w:rPr>
-        <w:t xml:space="preserve"> </w:t>
-      </w:r>
-      <w:r>
-        <w:rPr>
-          <w:rFonts w:asciiTheme="majorHAnsi" w:hAnsiTheme="majorHAnsi" w:cs="Arial"/>
-        </w:rPr>
-        <w:t>inserts were sequenced using ONT long-read technolog</w:t>
-      </w:r>
-      <w:r>
-        <w:rPr>
-          <w:rFonts w:asciiTheme="majorHAnsi" w:hAnsiTheme="majorHAnsi" w:cs="Arial"/>
-        </w:rPr>
-        <w:t>y,</w:t>
-      </w:r>
-      <w:r>
-        <w:rPr>
-          <w:rFonts w:asciiTheme="majorHAnsi" w:hAnsiTheme="majorHAnsi" w:cs="Arial"/>
-        </w:rPr>
-        <w:t xml:space="preserve"> with N50s </w:t>
-      </w:r>
-      <w:commentRangeStart w:id="2"/>
-      <w:r>
-        <w:rPr>
-          <w:rFonts w:asciiTheme="majorHAnsi" w:hAnsiTheme="majorHAnsi" w:cs="Arial"/>
-        </w:rPr>
-        <w:t>635-5327 kb</w:t>
-      </w:r>
-      <w:r>
-        <w:rPr>
-          <w:rFonts w:asciiTheme="majorHAnsi" w:hAnsiTheme="majorHAnsi" w:cs="Arial"/>
-        </w:rPr>
-        <w:t xml:space="preserve">, </w:t>
-      </w:r>
-      <w:r>
-        <w:rPr>
-          <w:rFonts w:asciiTheme="majorHAnsi" w:hAnsiTheme="majorHAnsi" w:cs="Arial"/>
-        </w:rPr>
-        <w:t xml:space="preserve">and </w:t>
-      </w:r>
-      <w:r>
-        <w:rPr>
-          <w:rFonts w:asciiTheme="majorHAnsi" w:hAnsiTheme="majorHAnsi" w:cs="Arial"/>
-        </w:rPr>
-        <w:t>95.2-99.5</w:t>
-      </w:r>
-      <w:commentRangeEnd w:id="2"/>
+        <w:t>#</w:t>
+      </w:r>
+      <w:commentRangeEnd w:id="3"/>
       <w:r>
         <w:rPr>
           <w:rStyle w:val="CommentReference"/>
         </w:rPr>
-        <w:commentReference w:id="2"/>
-      </w:r>
-      <w:r>
-        <w:rPr>
-          <w:rFonts w:asciiTheme="majorHAnsi" w:hAnsiTheme="majorHAnsi" w:cs="Arial"/>
-        </w:rPr>
-        <w:t xml:space="preserve">% complete </w:t>
-      </w:r>
-      <w:r>
-        <w:rPr>
-          <w:rFonts w:asciiTheme="majorHAnsi" w:hAnsiTheme="majorHAnsi" w:cs="Arial"/>
-          <w:color w:val="000000" w:themeColor="text1"/>
-        </w:rPr>
-        <w:t>BUSCO</w:t>
-      </w:r>
-      <w:r>
-        <w:rPr>
-          <w:rFonts w:asciiTheme="majorHAnsi" w:hAnsiTheme="majorHAnsi" w:cs="Arial"/>
-          <w:color w:val="000000" w:themeColor="text1"/>
-        </w:rPr>
-        <w:t>s</w:t>
-      </w:r>
-      <w:r>
-        <w:rPr>
-          <w:rFonts w:asciiTheme="majorHAnsi" w:hAnsiTheme="majorHAnsi" w:cs="Arial"/>
-          <w:color w:val="000000" w:themeColor="text1"/>
-        </w:rPr>
-        <w:t xml:space="preserve"> </w:t>
-      </w:r>
-      <w:r>
-        <w:rPr>
-          <w:rFonts w:asciiTheme="majorHAnsi" w:hAnsiTheme="majorHAnsi" w:cs="Arial"/>
-          <w:color w:val="000000" w:themeColor="text1"/>
-        </w:rPr>
-        <w:t>(Table S</w:t>
-      </w:r>
-      <w:r>
-        <w:rPr>
-          <w:rFonts w:asciiTheme="majorHAnsi" w:hAnsiTheme="majorHAnsi" w:cs="Arial"/>
-          <w:color w:val="000000" w:themeColor="text1"/>
-        </w:rPr>
-        <w:t>2</w:t>
-      </w:r>
-      <w:r>
-        <w:rPr>
-          <w:rFonts w:asciiTheme="majorHAnsi" w:hAnsiTheme="majorHAnsi" w:cs="Arial"/>
-          <w:color w:val="000000" w:themeColor="text1"/>
-        </w:rPr>
-        <w:t>)</w:t>
-      </w:r>
-      <w:r>
-        <w:rPr>
-          <w:rFonts w:asciiTheme="majorHAnsi" w:hAnsiTheme="majorHAnsi" w:cs="Arial"/>
-          <w:color w:val="000000" w:themeColor="text1"/>
-        </w:rPr>
-        <w:t xml:space="preserve">. </w:t>
-      </w:r>
-      <w:commentRangeStart w:id="3"/>
-      <w:r>
-        <w:rPr>
-          <w:rFonts w:asciiTheme="majorHAnsi" w:hAnsiTheme="majorHAnsi" w:cs="Arial"/>
-        </w:rPr>
-        <w:t>Most inserts (#%)</w:t>
-      </w:r>
-      <w:commentRangeEnd w:id="3"/>
-      <w:r>
-        <w:rPr>
-          <w:rStyle w:val="CommentReference"/>
-        </w:rPr>
         <w:commentReference w:id="3"/>
-      </w:r>
-      <w:r>
-        <w:rPr>
-          <w:rFonts w:asciiTheme="majorHAnsi" w:hAnsiTheme="majorHAnsi" w:cs="Arial"/>
-        </w:rPr>
-        <w:t xml:space="preserve"> were found within long reads, flanked either side by cockroach host sequence (Figure 1). Further, the long-read sequencing depth of these insert regions was typically &gt;</w:t>
-      </w:r>
-      <w:commentRangeStart w:id="4"/>
-      <w:r>
-        <w:rPr>
-          <w:rFonts w:asciiTheme="majorHAnsi" w:hAnsiTheme="majorHAnsi" w:cs="Arial"/>
-          <w:color w:val="FF0000"/>
-        </w:rPr>
-        <w:t>#</w:t>
-      </w:r>
-      <w:commentRangeEnd w:id="4"/>
-      <w:r>
-        <w:rPr>
-          <w:rStyle w:val="CommentReference"/>
-        </w:rPr>
-        <w:commentReference w:id="4"/>
       </w:r>
       <w:r>
         <w:rPr>
@@ -2950,12 +2935,149 @@
         </w:rPr>
         <w:t>genom</w:t>
       </w:r>
+      <w:commentRangeStart w:id="4"/>
+      <w:r>
+        <w:rPr>
+          <w:rFonts w:asciiTheme="majorHAnsi" w:hAnsiTheme="majorHAnsi" w:cs="Arial"/>
+        </w:rPr>
+        <w:t>e</w:t>
+      </w:r>
+      <w:commentRangeEnd w:id="4"/>
+      <w:r>
+        <w:rPr>
+          <w:rStyle w:val="CommentReference"/>
+        </w:rPr>
+        <w:commentReference w:id="4"/>
+      </w:r>
+      <w:r>
+        <w:rPr>
+          <w:rFonts w:asciiTheme="majorHAnsi" w:hAnsiTheme="majorHAnsi" w:cs="Arial"/>
+        </w:rPr>
+        <w:t xml:space="preserve">. </w:t>
+      </w:r>
+      <w:r>
+        <w:rPr>
+          <w:rFonts w:asciiTheme="majorHAnsi" w:hAnsiTheme="majorHAnsi" w:cs="Arial"/>
+        </w:rPr>
+        <w:t>In the f</w:t>
+      </w:r>
+      <w:r>
+        <w:rPr>
+          <w:rFonts w:asciiTheme="majorHAnsi" w:hAnsiTheme="majorHAnsi" w:cs="Arial"/>
+        </w:rPr>
+        <w:t>ive</w:t>
+      </w:r>
+      <w:r>
+        <w:rPr>
+          <w:rFonts w:asciiTheme="majorHAnsi" w:hAnsiTheme="majorHAnsi" w:cs="Arial"/>
+        </w:rPr>
+        <w:t xml:space="preserve"> cockroach species with the highest number of inserts (&gt;4000), the total amount of inserted </w:t>
+      </w:r>
+      <w:r>
+        <w:rPr>
+          <w:rFonts w:asciiTheme="majorHAnsi" w:hAnsiTheme="majorHAnsi" w:cs="Arial"/>
+          <w:color w:val="000000" w:themeColor="text1"/>
+        </w:rPr>
+        <w:t xml:space="preserve">DNA ranged from </w:t>
+      </w:r>
+      <w:r>
+        <w:rPr>
+          <w:rFonts w:asciiTheme="majorHAnsi" w:hAnsiTheme="majorHAnsi" w:cs="Arial"/>
+          <w:color w:val="000000" w:themeColor="text1"/>
+        </w:rPr>
+        <w:t>687</w:t>
+      </w:r>
+      <w:r>
+        <w:rPr>
+          <w:rFonts w:asciiTheme="majorHAnsi" w:hAnsiTheme="majorHAnsi" w:cs="Arial"/>
+          <w:color w:val="000000" w:themeColor="text1"/>
+        </w:rPr>
+        <w:t>-</w:t>
+      </w:r>
+      <w:r>
+        <w:rPr>
+          <w:rFonts w:asciiTheme="majorHAnsi" w:hAnsiTheme="majorHAnsi" w:cs="Arial"/>
+          <w:color w:val="000000" w:themeColor="text1"/>
+        </w:rPr>
+        <w:t>1014</w:t>
+      </w:r>
+      <w:r>
+        <w:rPr>
+          <w:rFonts w:asciiTheme="majorHAnsi" w:hAnsiTheme="majorHAnsi" w:cs="Arial"/>
+          <w:color w:val="000000" w:themeColor="text1"/>
+        </w:rPr>
+        <w:t xml:space="preserve"> </w:t>
+      </w:r>
+      <w:r>
+        <w:rPr>
+          <w:rFonts w:asciiTheme="majorHAnsi" w:hAnsiTheme="majorHAnsi" w:cs="Arial"/>
+          <w:color w:val="000000" w:themeColor="text1"/>
+        </w:rPr>
+        <w:t>kb</w:t>
+      </w:r>
+      <w:r>
+        <w:rPr>
+          <w:rFonts w:asciiTheme="majorHAnsi" w:hAnsiTheme="majorHAnsi" w:cs="Arial"/>
+          <w:color w:val="000000" w:themeColor="text1"/>
+        </w:rPr>
+        <w:t xml:space="preserve">, representing </w:t>
+      </w:r>
+      <w:r>
+        <w:rPr>
+          <w:rFonts w:asciiTheme="majorHAnsi" w:hAnsiTheme="majorHAnsi" w:cs="Arial"/>
+          <w:color w:val="000000" w:themeColor="text1"/>
+        </w:rPr>
+        <w:t>0.05</w:t>
+      </w:r>
+      <w:r>
+        <w:rPr>
+          <w:rFonts w:asciiTheme="majorHAnsi" w:hAnsiTheme="majorHAnsi" w:cs="Arial"/>
+          <w:color w:val="000000" w:themeColor="text1"/>
+        </w:rPr>
+        <w:t>-</w:t>
+      </w:r>
+      <w:r>
+        <w:rPr>
+          <w:rFonts w:asciiTheme="majorHAnsi" w:hAnsiTheme="majorHAnsi" w:cs="Arial"/>
+          <w:color w:val="000000" w:themeColor="text1"/>
+        </w:rPr>
+        <w:t>0.06</w:t>
+      </w:r>
+      <w:r>
+        <w:rPr>
+          <w:rFonts w:asciiTheme="majorHAnsi" w:hAnsiTheme="majorHAnsi" w:cs="Arial"/>
+          <w:color w:val="000000" w:themeColor="text1"/>
+        </w:rPr>
+        <w:t xml:space="preserve">% of total </w:t>
+      </w:r>
+      <w:r>
+        <w:rPr>
+          <w:rFonts w:asciiTheme="majorHAnsi" w:hAnsiTheme="majorHAnsi" w:cs="Arial"/>
+          <w:color w:val="000000" w:themeColor="text1"/>
+        </w:rPr>
+        <w:t xml:space="preserve">cockroach </w:t>
+      </w:r>
+      <w:r>
+        <w:rPr>
+          <w:rFonts w:asciiTheme="majorHAnsi" w:hAnsiTheme="majorHAnsi" w:cs="Arial"/>
+          <w:color w:val="000000" w:themeColor="text1"/>
+        </w:rPr>
+        <w:t xml:space="preserve">genome length. </w:t>
+      </w:r>
+      <w:r>
+        <w:rPr>
+          <w:rFonts w:asciiTheme="majorHAnsi" w:hAnsiTheme="majorHAnsi" w:cs="Arial"/>
+          <w:color w:val="000000" w:themeColor="text1"/>
+        </w:rPr>
+        <w:t xml:space="preserve">An examination of insert position across all species revealed that </w:t>
+      </w:r>
       <w:commentRangeStart w:id="5"/>
       <w:r>
         <w:rPr>
           <w:rFonts w:asciiTheme="majorHAnsi" w:hAnsiTheme="majorHAnsi" w:cs="Arial"/>
-        </w:rPr>
-        <w:t>e</w:t>
+          <w:color w:val="FF0000"/>
+        </w:rPr>
+        <w:t>X</w:t>
       </w:r>
       <w:commentRangeEnd w:id="5"/>
       <w:r>
@@ -2963,84 +3085,6 @@
           <w:rStyle w:val="CommentReference"/>
         </w:rPr>
         <w:commentReference w:id="5"/>
-      </w:r>
-      <w:r>
-        <w:rPr>
-          <w:rFonts w:asciiTheme="majorHAnsi" w:hAnsiTheme="majorHAnsi" w:cs="Arial"/>
-        </w:rPr>
-        <w:t xml:space="preserve">. </w:t>
-      </w:r>
-      <w:r>
-        <w:rPr>
-          <w:rFonts w:asciiTheme="majorHAnsi" w:hAnsiTheme="majorHAnsi" w:cs="Arial"/>
-        </w:rPr>
-        <w:t xml:space="preserve">In the </w:t>
-      </w:r>
-      <w:proofErr w:type="gramStart"/>
-      <w:r>
-        <w:rPr>
-          <w:rFonts w:asciiTheme="majorHAnsi" w:hAnsiTheme="majorHAnsi" w:cs="Arial"/>
-        </w:rPr>
-        <w:t>four cockroach</w:t>
-      </w:r>
-      <w:proofErr w:type="gramEnd"/>
-      <w:r>
-        <w:rPr>
-          <w:rFonts w:asciiTheme="majorHAnsi" w:hAnsiTheme="majorHAnsi" w:cs="Arial"/>
-        </w:rPr>
-        <w:t xml:space="preserve"> species with the highest number of inserts (&gt;4000), the total amount of inserted DNA ranged from </w:t>
-      </w:r>
-      <w:r>
-        <w:rPr>
-          <w:rFonts w:asciiTheme="majorHAnsi" w:hAnsiTheme="majorHAnsi" w:cs="Arial"/>
-          <w:color w:val="FF0000"/>
-        </w:rPr>
-        <w:t xml:space="preserve">X-Y </w:t>
-      </w:r>
-      <w:r>
-        <w:rPr>
-          <w:rFonts w:asciiTheme="majorHAnsi" w:hAnsiTheme="majorHAnsi" w:cs="Arial"/>
-        </w:rPr>
-        <w:t xml:space="preserve">bp, representing </w:t>
-      </w:r>
-      <w:r>
-        <w:rPr>
-          <w:rFonts w:asciiTheme="majorHAnsi" w:hAnsiTheme="majorHAnsi" w:cs="Arial"/>
-          <w:color w:val="FF0000"/>
-        </w:rPr>
-        <w:t>X-Y</w:t>
-      </w:r>
-      <w:r>
-        <w:rPr>
-          <w:rFonts w:asciiTheme="majorHAnsi" w:hAnsiTheme="majorHAnsi" w:cs="Arial"/>
-        </w:rPr>
-        <w:t xml:space="preserve">% of total </w:t>
-      </w:r>
-      <w:r>
-        <w:rPr>
-          <w:rFonts w:asciiTheme="majorHAnsi" w:hAnsiTheme="majorHAnsi" w:cs="Arial"/>
-        </w:rPr>
-        <w:t xml:space="preserve">cockroach </w:t>
-      </w:r>
-      <w:r>
-        <w:rPr>
-          <w:rFonts w:asciiTheme="majorHAnsi" w:hAnsiTheme="majorHAnsi" w:cs="Arial"/>
-        </w:rPr>
-        <w:t xml:space="preserve">genome length. </w:t>
-      </w:r>
-      <w:r>
-        <w:rPr>
-          <w:rFonts w:asciiTheme="majorHAnsi" w:hAnsiTheme="majorHAnsi" w:cs="Arial"/>
-          <w:color w:val="000000" w:themeColor="text1"/>
-        </w:rPr>
-        <w:t xml:space="preserve">An examination of insert position across all species revealed that </w:t>
-      </w:r>
-      <w:r>
-        <w:rPr>
-          <w:rFonts w:asciiTheme="majorHAnsi" w:hAnsiTheme="majorHAnsi" w:cs="Arial"/>
-          <w:color w:val="FF0000"/>
-        </w:rPr>
-        <w:t>X</w:t>
       </w:r>
       <w:r>
         <w:rPr>
@@ -3261,6 +3305,7 @@
         <w:rPr>
           <w:rFonts w:asciiTheme="majorHAnsi" w:hAnsiTheme="majorHAnsi" w:cs="Arial"/>
         </w:rPr>
+        <w:lastRenderedPageBreak/>
         <w:t>C</w:t>
       </w:r>
       <w:r>
@@ -4040,18 +4085,8 @@
           <w:i/>
           <w:iCs/>
         </w:rPr>
-        <w:t xml:space="preserve">Z. </w:t>
-      </w:r>
-      <w:proofErr w:type="spellStart"/>
-      <w:r>
-        <w:rPr>
-          <w:rFonts w:asciiTheme="majorHAnsi" w:hAnsiTheme="majorHAnsi" w:cs="Arial"/>
-          <w:i/>
-          <w:iCs/>
-        </w:rPr>
-        <w:t>nevadensis</w:t>
-      </w:r>
-      <w:proofErr w:type="spellEnd"/>
+        <w:t>Z. nevadensis</w:t>
+      </w:r>
       <w:r>
         <w:rPr>
           <w:rFonts w:asciiTheme="majorHAnsi" w:hAnsiTheme="majorHAnsi" w:cs="Arial"/>
@@ -4519,12 +4554,27 @@
         </w:rPr>
         <w:t xml:space="preserve">of length </w:t>
       </w:r>
+      <w:commentRangeStart w:id="16"/>
       <w:r>
         <w:rPr>
           <w:rFonts w:asciiTheme="majorHAnsi" w:hAnsiTheme="majorHAnsi" w:cs="Arial"/>
           <w:color w:val="FF0000"/>
         </w:rPr>
-        <w:t xml:space="preserve">X-Y </w:t>
+        <w:t>X-Y</w:t>
+      </w:r>
+      <w:commentRangeEnd w:id="16"/>
+      <w:r>
+        <w:rPr>
+          <w:rStyle w:val="CommentReference"/>
+        </w:rPr>
+        <w:commentReference w:id="16"/>
+      </w:r>
+      <w:r>
+        <w:rPr>
+          <w:rFonts w:asciiTheme="majorHAnsi" w:hAnsiTheme="majorHAnsi" w:cs="Arial"/>
+          <w:color w:val="FF0000"/>
+        </w:rPr>
+        <w:t xml:space="preserve"> </w:t>
       </w:r>
       <w:r>
         <w:rPr>
@@ -4621,7 +4671,7 @@
         </w:rPr>
         <w:t xml:space="preserve">A maximum of </w:t>
       </w:r>
-      <w:commentRangeStart w:id="16"/>
+      <w:commentRangeStart w:id="17"/>
       <w:r>
         <w:rPr>
           <w:rFonts w:asciiTheme="majorHAnsi" w:hAnsiTheme="majorHAnsi" w:cs="Arial"/>
@@ -4629,12 +4679,12 @@
         </w:rPr>
         <w:t>eight</w:t>
       </w:r>
-      <w:commentRangeEnd w:id="16"/>
+      <w:commentRangeEnd w:id="17"/>
       <w:r>
         <w:rPr>
           <w:rStyle w:val="CommentReference"/>
         </w:rPr>
-        <w:commentReference w:id="16"/>
+        <w:commentReference w:id="17"/>
       </w:r>
       <w:r>
         <w:rPr>
@@ -4669,7 +4719,7 @@
         </w:rPr>
         <w:t xml:space="preserve"> to each other. </w:t>
       </w:r>
-      <w:commentRangeStart w:id="17"/>
+      <w:commentRangeStart w:id="18"/>
       <w:r>
         <w:rPr>
           <w:rFonts w:asciiTheme="majorHAnsi" w:hAnsiTheme="majorHAnsi" w:cs="Arial"/>
@@ -4816,12 +4866,12 @@
         </w:rPr>
         <w:t>).</w:t>
       </w:r>
-      <w:commentRangeEnd w:id="17"/>
+      <w:commentRangeEnd w:id="18"/>
       <w:r>
         <w:rPr>
           <w:rStyle w:val="CommentReference"/>
         </w:rPr>
-        <w:commentReference w:id="17"/>
+        <w:commentReference w:id="18"/>
       </w:r>
     </w:p>
     <w:p>
@@ -4894,26 +4944,32 @@
         <w:rPr>
           <w:rFonts w:asciiTheme="majorHAnsi" w:hAnsiTheme="majorHAnsi" w:cs="Arial"/>
         </w:rPr>
+        <w:t xml:space="preserve">insertions with homology to protein-coding sequence, </w:t>
+      </w:r>
+      <w:r>
+        <w:rPr>
+          <w:rFonts w:asciiTheme="majorHAnsi" w:hAnsiTheme="majorHAnsi" w:cs="Arial"/>
+        </w:rPr>
+        <w:t xml:space="preserve">transfers that result in sequences that do not encode proteins, or </w:t>
+      </w:r>
+      <w:r>
+        <w:rPr>
+          <w:rFonts w:asciiTheme="majorHAnsi" w:hAnsiTheme="majorHAnsi" w:cs="Arial"/>
+        </w:rPr>
+        <w:t xml:space="preserve">that result in </w:t>
+      </w:r>
+      <w:r>
+        <w:rPr>
+          <w:rFonts w:asciiTheme="majorHAnsi" w:hAnsiTheme="majorHAnsi" w:cs="Arial"/>
+        </w:rPr>
+        <w:t xml:space="preserve">sequences of unknown function, have been largely </w:t>
+      </w:r>
+      <w:r>
+        <w:rPr>
+          <w:rFonts w:asciiTheme="majorHAnsi" w:hAnsiTheme="majorHAnsi" w:cs="Arial"/>
+        </w:rPr>
         <w:lastRenderedPageBreak/>
-        <w:t xml:space="preserve">insertions with homology to protein-coding sequence, </w:t>
-      </w:r>
-      <w:r>
-        <w:rPr>
-          <w:rFonts w:asciiTheme="majorHAnsi" w:hAnsiTheme="majorHAnsi" w:cs="Arial"/>
-        </w:rPr>
-        <w:t xml:space="preserve">transfers that result in sequences that do not encode proteins, or </w:t>
-      </w:r>
-      <w:r>
-        <w:rPr>
-          <w:rFonts w:asciiTheme="majorHAnsi" w:hAnsiTheme="majorHAnsi" w:cs="Arial"/>
-        </w:rPr>
-        <w:t xml:space="preserve">that result in </w:t>
-      </w:r>
-      <w:r>
-        <w:rPr>
-          <w:rFonts w:asciiTheme="majorHAnsi" w:hAnsiTheme="majorHAnsi" w:cs="Arial"/>
-        </w:rPr>
-        <w:t>sequences of unknown function, have been largely ignored. Such insertions</w:t>
+        <w:t>ignored. Such insertions</w:t>
       </w:r>
       <w:r>
         <w:rPr>
@@ -5293,17 +5349,8 @@
           <w:rFonts w:asciiTheme="majorHAnsi" w:hAnsiTheme="majorHAnsi" w:cs="Arial"/>
           <w:i/>
         </w:rPr>
-        <w:t xml:space="preserve"> </w:t>
-      </w:r>
-      <w:proofErr w:type="spellStart"/>
-      <w:r>
-        <w:rPr>
-          <w:rFonts w:asciiTheme="majorHAnsi" w:hAnsiTheme="majorHAnsi" w:cs="Arial"/>
-          <w:i/>
-        </w:rPr>
-        <w:t>americana</w:t>
-      </w:r>
-      <w:proofErr w:type="spellEnd"/>
+        <w:t xml:space="preserve"> americana</w:t>
+      </w:r>
       <w:r>
         <w:rPr>
           <w:rFonts w:asciiTheme="majorHAnsi" w:hAnsiTheme="majorHAnsi" w:cs="Arial"/>
@@ -5948,15 +5995,109 @@
           <w:i/>
           <w:iCs/>
         </w:rPr>
+        <w:t>Blattabacterium</w:t>
+      </w:r>
+      <w:proofErr w:type="spellEnd"/>
+      <w:r>
+        <w:rPr>
+          <w:rFonts w:asciiTheme="majorHAnsi" w:hAnsiTheme="majorHAnsi" w:cs="Arial"/>
+          <w:i/>
+          <w:iCs/>
+        </w:rPr>
+        <w:t xml:space="preserve"> </w:t>
+      </w:r>
+      <w:r>
+        <w:rPr>
+          <w:rFonts w:asciiTheme="majorHAnsi" w:hAnsiTheme="majorHAnsi" w:cs="Arial"/>
+        </w:rPr>
+        <w:t xml:space="preserve">cell division in host tissues is associated with increased rates of horizontal DNA transfer remains to be determined. </w:t>
+      </w:r>
+      <w:r>
+        <w:rPr>
+          <w:rFonts w:asciiTheme="majorHAnsi" w:hAnsiTheme="majorHAnsi" w:cs="Arial"/>
+        </w:rPr>
+        <w:t xml:space="preserve">We previously </w:t>
+      </w:r>
+      <w:r>
+        <w:rPr>
+          <w:rFonts w:asciiTheme="majorHAnsi" w:hAnsiTheme="majorHAnsi" w:cs="Arial"/>
+        </w:rPr>
+        <w:t xml:space="preserve">found that </w:t>
+      </w:r>
+      <w:proofErr w:type="spellStart"/>
+      <w:r>
+        <w:rPr>
+          <w:rFonts w:asciiTheme="majorHAnsi" w:hAnsiTheme="majorHAnsi" w:cs="Arial"/>
+        </w:rPr>
+        <w:t>Panesthiinae</w:t>
+      </w:r>
+      <w:proofErr w:type="spellEnd"/>
+      <w:r>
+        <w:rPr>
+          <w:rFonts w:asciiTheme="majorHAnsi" w:hAnsiTheme="majorHAnsi" w:cs="Arial"/>
+        </w:rPr>
+        <w:t xml:space="preserve"> exhibit considerably more genome-wide relaxed selection compare</w:t>
+      </w:r>
+      <w:r>
+        <w:rPr>
+          <w:rFonts w:asciiTheme="majorHAnsi" w:hAnsiTheme="majorHAnsi" w:cs="Arial"/>
+        </w:rPr>
+        <w:t>d</w:t>
+      </w:r>
+      <w:r>
+        <w:rPr>
+          <w:rFonts w:asciiTheme="majorHAnsi" w:hAnsiTheme="majorHAnsi" w:cs="Arial"/>
+        </w:rPr>
+        <w:t xml:space="preserve"> to </w:t>
+      </w:r>
+      <w:r>
+        <w:rPr>
+          <w:rFonts w:asciiTheme="majorHAnsi" w:hAnsiTheme="majorHAnsi" w:cs="Arial"/>
+        </w:rPr>
+        <w:t xml:space="preserve">other cockroaches, including those examined here </w:t>
+      </w:r>
+      <w:r>
+        <w:rPr>
+          <w:rFonts w:asciiTheme="majorHAnsi" w:hAnsiTheme="majorHAnsi" w:cs="Arial"/>
+        </w:rPr>
+        <w:t>(Ewart et al., 2024)</w:t>
+      </w:r>
+      <w:r>
+        <w:rPr>
+          <w:rFonts w:asciiTheme="majorHAnsi" w:hAnsiTheme="majorHAnsi" w:cs="Arial"/>
+        </w:rPr>
+        <w:t>. I</w:t>
+      </w:r>
+      <w:r>
+        <w:rPr>
+          <w:rFonts w:asciiTheme="majorHAnsi" w:hAnsiTheme="majorHAnsi" w:cs="Arial"/>
+        </w:rPr>
+        <w:t xml:space="preserve">nsufficient purifying selection could possibly allow </w:t>
+      </w:r>
+      <w:r>
+        <w:rPr>
+          <w:rFonts w:asciiTheme="majorHAnsi" w:hAnsiTheme="majorHAnsi" w:cs="Arial"/>
+        </w:rPr>
         <w:lastRenderedPageBreak/>
-        <w:t>Blattabacterium</w:t>
+        <w:t>larger numbers of</w:t>
+      </w:r>
+      <w:r>
+        <w:rPr>
+          <w:rFonts w:asciiTheme="majorHAnsi" w:hAnsiTheme="majorHAnsi" w:cs="Arial"/>
+        </w:rPr>
+        <w:t xml:space="preserve"> inserts to persist in </w:t>
+      </w:r>
+      <w:proofErr w:type="spellStart"/>
+      <w:r>
+        <w:rPr>
+          <w:rFonts w:asciiTheme="majorHAnsi" w:hAnsiTheme="majorHAnsi" w:cs="Arial"/>
+        </w:rPr>
+        <w:t>Panesthiinae</w:t>
       </w:r>
       <w:proofErr w:type="spellEnd"/>
       <w:r>
         <w:rPr>
           <w:rFonts w:asciiTheme="majorHAnsi" w:hAnsiTheme="majorHAnsi" w:cs="Arial"/>
-          <w:i/>
-          <w:iCs/>
         </w:rPr>
         <w:t xml:space="preserve"> </w:t>
       </w:r>
@@ -5964,19 +6105,13 @@
         <w:rPr>
           <w:rFonts w:asciiTheme="majorHAnsi" w:hAnsiTheme="majorHAnsi" w:cs="Arial"/>
         </w:rPr>
-        <w:t xml:space="preserve">cell division in host tissues is associated with increased rates of horizontal DNA transfer remains to be determined. </w:t>
-      </w:r>
-      <w:r>
-        <w:rPr>
-          <w:rFonts w:asciiTheme="majorHAnsi" w:hAnsiTheme="majorHAnsi" w:cs="Arial"/>
-        </w:rPr>
-        <w:t xml:space="preserve">We previously </w:t>
-      </w:r>
-      <w:r>
-        <w:rPr>
-          <w:rFonts w:asciiTheme="majorHAnsi" w:hAnsiTheme="majorHAnsi" w:cs="Arial"/>
-        </w:rPr>
-        <w:t xml:space="preserve">found that </w:t>
+        <w:t>genomes.</w:t>
+      </w:r>
+      <w:r>
+        <w:rPr>
+          <w:rFonts w:asciiTheme="majorHAnsi" w:hAnsiTheme="majorHAnsi" w:cs="Arial"/>
+        </w:rPr>
+        <w:t xml:space="preserve"> The putatively ancestral inserts in the </w:t>
       </w:r>
       <w:proofErr w:type="spellStart"/>
       <w:r>
@@ -5990,131 +6125,7 @@
         <w:rPr>
           <w:rFonts w:asciiTheme="majorHAnsi" w:hAnsiTheme="majorHAnsi" w:cs="Arial"/>
         </w:rPr>
-        <w:t xml:space="preserve"> exhibit considerably more genome-wide relaxed selection compare</w:t>
-      </w:r>
-      <w:r>
-        <w:rPr>
-          <w:rFonts w:asciiTheme="majorHAnsi" w:hAnsiTheme="majorHAnsi" w:cs="Arial"/>
-        </w:rPr>
-        <w:t>d</w:t>
-      </w:r>
-      <w:r>
-        <w:rPr>
-          <w:rFonts w:asciiTheme="majorHAnsi" w:hAnsiTheme="majorHAnsi" w:cs="Arial"/>
-        </w:rPr>
-        <w:t xml:space="preserve"> to </w:t>
-      </w:r>
-      <w:r>
-        <w:rPr>
-          <w:rFonts w:asciiTheme="majorHAnsi" w:hAnsiTheme="majorHAnsi" w:cs="Arial"/>
-        </w:rPr>
-        <w:t xml:space="preserve">other cockroaches, including those examined here </w:t>
-      </w:r>
-      <w:r>
-        <w:rPr>
-          <w:rFonts w:asciiTheme="majorHAnsi" w:hAnsiTheme="majorHAnsi" w:cs="Arial"/>
-        </w:rPr>
-        <w:t>(Ewart et al., 2024)</w:t>
-      </w:r>
-      <w:r>
-        <w:rPr>
-          <w:rFonts w:asciiTheme="majorHAnsi" w:hAnsiTheme="majorHAnsi" w:cs="Arial"/>
-        </w:rPr>
-        <w:t>. I</w:t>
-      </w:r>
-      <w:r>
-        <w:rPr>
-          <w:rFonts w:asciiTheme="majorHAnsi" w:hAnsiTheme="majorHAnsi" w:cs="Arial"/>
-        </w:rPr>
-        <w:t xml:space="preserve">nsufficient purifying selection could possibly allow </w:t>
-      </w:r>
-      <w:r>
-        <w:rPr>
-          <w:rFonts w:asciiTheme="majorHAnsi" w:hAnsiTheme="majorHAnsi" w:cs="Arial"/>
-        </w:rPr>
-        <w:t>larger numbers of</w:t>
-      </w:r>
-      <w:r>
-        <w:rPr>
-          <w:rFonts w:asciiTheme="majorHAnsi" w:hAnsiTheme="majorHAnsi" w:cs="Arial"/>
-        </w:rPr>
-        <w:t xml:space="preserve"> inserts to persist in </w:t>
-      </w:r>
-      <w:proofErr w:type="spellStart"/>
-      <w:r>
-        <w:rPr>
-          <w:rFonts w:asciiTheme="majorHAnsi" w:hAnsiTheme="majorHAnsi" w:cs="Arial"/>
-        </w:rPr>
-        <w:t>Panesthiinae</w:t>
-      </w:r>
-      <w:proofErr w:type="spellEnd"/>
-      <w:r>
-        <w:rPr>
-          <w:rFonts w:asciiTheme="majorHAnsi" w:hAnsiTheme="majorHAnsi" w:cs="Arial"/>
-        </w:rPr>
-        <w:t xml:space="preserve"> </w:t>
-      </w:r>
-      <w:r>
-        <w:rPr>
-          <w:rFonts w:asciiTheme="majorHAnsi" w:hAnsiTheme="majorHAnsi" w:cs="Arial"/>
-        </w:rPr>
-        <w:t>genomes.</w:t>
-      </w:r>
-      <w:r>
-        <w:rPr>
-          <w:rFonts w:asciiTheme="majorHAnsi" w:hAnsiTheme="majorHAnsi" w:cs="Arial"/>
-        </w:rPr>
-        <w:t xml:space="preserve"> The</w:t>
-      </w:r>
-      <w:r>
-        <w:rPr>
-          <w:rFonts w:asciiTheme="majorHAnsi" w:hAnsiTheme="majorHAnsi" w:cs="Arial"/>
-        </w:rPr>
-        <w:t xml:space="preserve"> </w:t>
-      </w:r>
-      <w:r>
-        <w:rPr>
-          <w:rFonts w:asciiTheme="majorHAnsi" w:hAnsiTheme="majorHAnsi" w:cs="Arial"/>
-        </w:rPr>
-        <w:t xml:space="preserve">putatively ancestral </w:t>
-      </w:r>
-      <w:r>
-        <w:rPr>
-          <w:rFonts w:asciiTheme="majorHAnsi" w:hAnsiTheme="majorHAnsi" w:cs="Arial"/>
-        </w:rPr>
-        <w:t xml:space="preserve">inserts </w:t>
-      </w:r>
-      <w:r>
-        <w:rPr>
-          <w:rFonts w:asciiTheme="majorHAnsi" w:hAnsiTheme="majorHAnsi" w:cs="Arial"/>
-        </w:rPr>
-        <w:t xml:space="preserve">in </w:t>
-      </w:r>
-      <w:r>
-        <w:rPr>
-          <w:rFonts w:asciiTheme="majorHAnsi" w:hAnsiTheme="majorHAnsi" w:cs="Arial"/>
-        </w:rPr>
-        <w:t xml:space="preserve">the </w:t>
-      </w:r>
-      <w:proofErr w:type="spellStart"/>
-      <w:r>
-        <w:rPr>
-          <w:rFonts w:asciiTheme="majorHAnsi" w:hAnsiTheme="majorHAnsi" w:cs="Arial"/>
-        </w:rPr>
-        <w:t>Panesthiinae</w:t>
-      </w:r>
-      <w:proofErr w:type="spellEnd"/>
-      <w:r>
-        <w:rPr>
-          <w:rFonts w:asciiTheme="majorHAnsi" w:hAnsiTheme="majorHAnsi" w:cs="Arial"/>
-        </w:rPr>
-        <w:t xml:space="preserve">, inferred to have transferred &gt;28.7 Mya, may be suggestive of a functional role. </w:t>
-      </w:r>
-      <w:r>
-        <w:rPr>
-          <w:rFonts w:asciiTheme="majorHAnsi" w:hAnsiTheme="majorHAnsi" w:cs="Arial"/>
-        </w:rPr>
-        <w:t xml:space="preserve">Further, </w:t>
+        <w:t xml:space="preserve">, inferred to have transferred &gt;28.7 Mya, may be suggestive of a functional role. Further, </w:t>
       </w:r>
       <w:commentRangeStart w:id="23"/>
       <w:r>
@@ -6173,19 +6184,7 @@
         <w:rPr>
           <w:rFonts w:asciiTheme="majorHAnsi" w:hAnsiTheme="majorHAnsi" w:cs="Arial"/>
         </w:rPr>
-        <w:t xml:space="preserve"> </w:t>
-      </w:r>
-      <w:r>
-        <w:rPr>
-          <w:rFonts w:asciiTheme="majorHAnsi" w:hAnsiTheme="majorHAnsi" w:cs="Arial"/>
-        </w:rPr>
-        <w:t xml:space="preserve">However, </w:t>
-      </w:r>
-      <w:r>
-        <w:rPr>
-          <w:rFonts w:asciiTheme="majorHAnsi" w:hAnsiTheme="majorHAnsi" w:cs="Arial"/>
-        </w:rPr>
-        <w:t xml:space="preserve">the function of </w:t>
+        <w:t xml:space="preserve"> However, the function of </w:t>
       </w:r>
       <w:proofErr w:type="spellStart"/>
       <w:r>
@@ -6244,19 +6243,11 @@
         </w:rPr>
         <w:t xml:space="preserve">; </w:t>
       </w:r>
-      <w:proofErr w:type="spellStart"/>
-      <w:r>
-        <w:rPr>
-          <w:rFonts w:asciiTheme="majorHAnsi" w:hAnsiTheme="majorHAnsi"/>
-        </w:rPr>
-        <w:t>Pamilo</w:t>
-      </w:r>
-      <w:proofErr w:type="spellEnd"/>
-      <w:r>
-        <w:rPr>
-          <w:rFonts w:asciiTheme="majorHAnsi" w:hAnsiTheme="majorHAnsi"/>
-        </w:rPr>
-        <w:t xml:space="preserve"> et al., 2007; </w:t>
+      <w:r>
+        <w:rPr>
+          <w:rFonts w:asciiTheme="majorHAnsi" w:hAnsiTheme="majorHAnsi"/>
+        </w:rPr>
+        <w:t xml:space="preserve">Pamilo et al., 2007; </w:t>
       </w:r>
       <w:proofErr w:type="spellStart"/>
       <w:r>
@@ -6894,10 +6885,20 @@
         <w:jc w:val="both"/>
         <w:rPr>
           <w:rFonts w:asciiTheme="majorHAnsi" w:hAnsiTheme="majorHAnsi"/>
-          <w:b/>
-          <w:i/>
-        </w:rPr>
-      </w:pPr>
+          <w:bCs/>
+          <w:i/>
+          <w:color w:val="EE0000"/>
+        </w:rPr>
+      </w:pPr>
+      <w:r>
+        <w:rPr>
+          <w:rFonts w:asciiTheme="majorHAnsi" w:hAnsiTheme="majorHAnsi"/>
+          <w:bCs/>
+          <w:i/>
+          <w:color w:val="EE0000"/>
+        </w:rPr>
+        <w:t>I believe we will put all of the supplementary information into the STAR methods (except for the Figures and Tables)</w:t>
+      </w:r>
     </w:p>
     <w:p>
       <w:pPr>
@@ -6908,123 +6909,66 @@
           <w:i/>
         </w:rPr>
       </w:pPr>
-      <w:r>
-        <w:rPr>
-          <w:rFonts w:asciiTheme="majorHAnsi" w:hAnsiTheme="majorHAnsi"/>
-          <w:b/>
-          <w:i/>
-        </w:rPr>
-        <w:t>Figure</w:t>
-      </w:r>
-      <w:r>
-        <w:rPr>
-          <w:rFonts w:asciiTheme="majorHAnsi" w:hAnsiTheme="majorHAnsi"/>
-          <w:b/>
-          <w:i/>
-        </w:rPr>
-        <w:t xml:space="preserve"> (maximum 1 figure or table)</w:t>
-      </w:r>
     </w:p>
     <w:p>
       <w:pPr>
         <w:jc w:val="both"/>
         <w:rPr>
           <w:rFonts w:asciiTheme="majorHAnsi" w:hAnsiTheme="majorHAnsi"/>
-          <w:bCs/>
-        </w:rPr>
-      </w:pPr>
-      <w:r>
-        <w:rPr>
-          <w:rFonts w:asciiTheme="majorHAnsi" w:hAnsiTheme="majorHAnsi"/>
-          <w:bCs/>
-        </w:rPr>
-        <w:lastRenderedPageBreak/>
-        <w:t>3-4 panels</w:t>
-      </w:r>
+          <w:b/>
+          <w:i/>
+        </w:rPr>
+      </w:pPr>
     </w:p>
     <w:p>
       <w:pPr>
         <w:jc w:val="both"/>
         <w:rPr>
           <w:rFonts w:asciiTheme="majorHAnsi" w:hAnsiTheme="majorHAnsi"/>
-          <w:bCs/>
-        </w:rPr>
-      </w:pPr>
-      <w:commentRangeStart w:id="29"/>
-      <w:commentRangeStart w:id="30"/>
-      <w:r>
-        <w:rPr>
-          <w:rFonts w:asciiTheme="majorHAnsi" w:hAnsiTheme="majorHAnsi"/>
-          <w:bCs/>
-        </w:rPr>
-        <w:t>Suggestion:</w:t>
-      </w:r>
-      <w:commentRangeEnd w:id="29"/>
-      <w:r>
-        <w:rPr>
-          <w:rStyle w:val="CommentReference"/>
-          <w:rFonts w:asciiTheme="majorHAnsi" w:hAnsiTheme="majorHAnsi"/>
-        </w:rPr>
-        <w:commentReference w:id="29"/>
-      </w:r>
-      <w:commentRangeEnd w:id="30"/>
-      <w:r>
-        <w:rPr>
-          <w:rStyle w:val="CommentReference"/>
-          <w:rFonts w:asciiTheme="majorHAnsi" w:hAnsiTheme="majorHAnsi"/>
-        </w:rPr>
-        <w:commentReference w:id="30"/>
-      </w:r>
+          <w:b/>
+          <w:i/>
+        </w:rPr>
+      </w:pPr>
     </w:p>
     <w:p>
       <w:pPr>
-        <w:pStyle w:val="ListParagraph"/>
-        <w:numPr>
-          <w:ilvl w:val="0"/>
-          <w:numId w:val="16"/>
-        </w:numPr>
         <w:jc w:val="both"/>
         <w:rPr>
           <w:rFonts w:asciiTheme="majorHAnsi" w:hAnsiTheme="majorHAnsi"/>
-          <w:bCs/>
-        </w:rPr>
-      </w:pPr>
-      <w:r>
-        <w:rPr>
-          <w:rFonts w:asciiTheme="majorHAnsi" w:hAnsiTheme="majorHAnsi"/>
-          <w:bCs/>
-        </w:rPr>
-        <w:t>Alongside a species tree:</w:t>
-      </w:r>
+          <w:b/>
+          <w:i/>
+        </w:rPr>
+      </w:pPr>
     </w:p>
     <w:p>
       <w:pPr>
-        <w:pStyle w:val="ListParagraph"/>
-        <w:numPr>
-          <w:ilvl w:val="1"/>
-          <w:numId w:val="16"/>
-        </w:numPr>
         <w:jc w:val="both"/>
         <w:rPr>
           <w:rFonts w:asciiTheme="majorHAnsi" w:hAnsiTheme="majorHAnsi"/>
-          <w:bCs/>
-        </w:rPr>
-      </w:pPr>
-      <w:r>
-        <w:rPr>
-          <w:rFonts w:asciiTheme="majorHAnsi" w:hAnsiTheme="majorHAnsi"/>
-          <w:bCs/>
-        </w:rPr>
-        <w:t>HGT insert counts, including and excluding duplicates</w:t>
+          <w:b/>
+          <w:i/>
+        </w:rPr>
+      </w:pPr>
+      <w:r>
+        <w:rPr>
+          <w:rFonts w:asciiTheme="majorHAnsi" w:hAnsiTheme="majorHAnsi"/>
+          <w:b/>
+          <w:i/>
+        </w:rPr>
+        <w:lastRenderedPageBreak/>
+        <w:t>Figure</w:t>
+      </w:r>
+      <w:r>
+        <w:rPr>
+          <w:rFonts w:asciiTheme="majorHAnsi" w:hAnsiTheme="majorHAnsi"/>
+          <w:b/>
+          <w:i/>
+        </w:rPr>
+        <w:t>s</w:t>
       </w:r>
     </w:p>
     <w:p>
       <w:pPr>
-        <w:pStyle w:val="ListParagraph"/>
-        <w:numPr>
-          <w:ilvl w:val="1"/>
-          <w:numId w:val="16"/>
-        </w:numPr>
         <w:jc w:val="both"/>
         <w:rPr>
           <w:rFonts w:asciiTheme="majorHAnsi" w:hAnsiTheme="majorHAnsi"/>
@@ -7036,172 +6980,176 @@
           <w:rFonts w:asciiTheme="majorHAnsi" w:hAnsiTheme="majorHAnsi"/>
           <w:bCs/>
         </w:rPr>
-        <w:t xml:space="preserve">Where the </w:t>
-      </w:r>
-      <w:proofErr w:type="spellStart"/>
-      <w:r>
-        <w:rPr>
-          <w:rFonts w:asciiTheme="majorHAnsi" w:hAnsiTheme="majorHAnsi"/>
-          <w:bCs/>
-        </w:rPr>
-        <w:t>ther</w:t>
-      </w:r>
-      <w:proofErr w:type="spellEnd"/>
-      <w:r>
-        <w:rPr>
-          <w:rFonts w:asciiTheme="majorHAnsi" w:hAnsiTheme="majorHAnsi"/>
-          <w:bCs/>
-        </w:rPr>
-        <w:t xml:space="preserve"> inserts are located, with a significance test determining whether this skews from expected</w:t>
+        <w:drawing>
+          <wp:inline distT="0" distB="0" distL="0" distR="0" wp14:anchorId="304D66CE" wp14:editId="5EDFD765">
+            <wp:extent cx="5731510" cy="2112645"/>
+            <wp:effectExtent l="0" t="0" r="0" b="0"/>
+            <wp:docPr id="855915542" name="Picture 1"/>
+            <wp:cNvGraphicFramePr>
+              <a:graphicFrameLocks xmlns:a="http://schemas.openxmlformats.org/drawingml/2006/main" noChangeAspect="1"/>
+            </wp:cNvGraphicFramePr>
+            <a:graphic xmlns:a="http://schemas.openxmlformats.org/drawingml/2006/main">
+              <a:graphicData uri="http://schemas.openxmlformats.org/drawingml/2006/picture">
+                <pic:pic xmlns:pic="http://schemas.openxmlformats.org/drawingml/2006/picture">
+                  <pic:nvPicPr>
+                    <pic:cNvPr id="855915542" name=""/>
+                    <pic:cNvPicPr/>
+                  </pic:nvPicPr>
+                  <pic:blipFill>
+                    <a:blip r:embed="rId10"/>
+                    <a:stretch>
+                      <a:fillRect/>
+                    </a:stretch>
+                  </pic:blipFill>
+                  <pic:spPr>
+                    <a:xfrm>
+                      <a:off x="0" y="0"/>
+                      <a:ext cx="5731510" cy="2112645"/>
+                    </a:xfrm>
+                    <a:prstGeom prst="rect">
+                      <a:avLst/>
+                    </a:prstGeom>
+                  </pic:spPr>
+                </pic:pic>
+              </a:graphicData>
+            </a:graphic>
+          </wp:inline>
+        </w:drawing>
       </w:r>
     </w:p>
     <w:p>
       <w:pPr>
-        <w:pStyle w:val="ListParagraph"/>
-        <w:numPr>
-          <w:ilvl w:val="2"/>
-          <w:numId w:val="16"/>
-        </w:numPr>
         <w:jc w:val="both"/>
         <w:rPr>
           <w:rFonts w:asciiTheme="majorHAnsi" w:hAnsiTheme="majorHAnsi"/>
+          <w:highlight w:val="yellow"/>
+        </w:rPr>
+      </w:pPr>
+      <w:r>
+        <w:rPr>
+          <w:rFonts w:asciiTheme="majorHAnsi" w:hAnsiTheme="majorHAnsi"/>
+          <w:b/>
           <w:bCs/>
         </w:rPr>
-      </w:pPr>
-      <w:r>
-        <w:rPr>
-          <w:rFonts w:asciiTheme="majorHAnsi" w:hAnsiTheme="majorHAnsi"/>
-          <w:bCs/>
-        </w:rPr>
-        <w:t>Separate where they are for recent vs ancestral</w:t>
+        <w:t>Figure 1.</w:t>
+      </w:r>
+      <w:r>
+        <w:rPr>
+          <w:rFonts w:asciiTheme="majorHAnsi" w:hAnsiTheme="majorHAnsi"/>
+        </w:rPr>
+        <w:t xml:space="preserve"> </w:t>
+      </w:r>
+      <w:r>
+        <w:rPr>
+          <w:rFonts w:asciiTheme="majorHAnsi" w:hAnsiTheme="majorHAnsi"/>
+          <w:highlight w:val="yellow"/>
+        </w:rPr>
+        <w:t xml:space="preserve">A. Cladogram of taxa analysed for </w:t>
+      </w:r>
+      <w:proofErr w:type="spellStart"/>
+      <w:r>
+        <w:rPr>
+          <w:rFonts w:asciiTheme="majorHAnsi" w:hAnsiTheme="majorHAnsi"/>
+          <w:highlight w:val="yellow"/>
+        </w:rPr>
+        <w:t>Blattabacterium</w:t>
+      </w:r>
+      <w:proofErr w:type="spellEnd"/>
+      <w:r>
+        <w:rPr>
+          <w:rFonts w:asciiTheme="majorHAnsi" w:hAnsiTheme="majorHAnsi"/>
+          <w:highlight w:val="yellow"/>
+        </w:rPr>
+        <w:t xml:space="preserve"> HGT events</w:t>
       </w:r>
     </w:p>
     <w:p>
       <w:pPr>
-        <w:pStyle w:val="ListParagraph"/>
-        <w:numPr>
-          <w:ilvl w:val="1"/>
-          <w:numId w:val="16"/>
-        </w:numPr>
         <w:jc w:val="both"/>
         <w:rPr>
           <w:rFonts w:asciiTheme="majorHAnsi" w:hAnsiTheme="majorHAnsi"/>
-          <w:bCs/>
-        </w:rPr>
-      </w:pPr>
-      <w:r>
-        <w:rPr>
-          <w:rFonts w:asciiTheme="majorHAnsi" w:hAnsiTheme="majorHAnsi"/>
-          <w:bCs/>
-        </w:rPr>
-        <w:t>Insert ages</w:t>
+          <w:highlight w:val="yellow"/>
+        </w:rPr>
+      </w:pPr>
+      <w:r>
+        <w:rPr>
+          <w:rFonts w:asciiTheme="majorHAnsi" w:hAnsiTheme="majorHAnsi"/>
+          <w:highlight w:val="yellow"/>
+        </w:rPr>
+        <w:t xml:space="preserve">Nodes show divergence times (Ma) from Beasley-Hall et al (2021: for nodes internal to top 12 taxa) and Evangelista et al (2019: for nodes internal to remaining 6 taxa). One exception is value between P. </w:t>
+      </w:r>
+      <w:proofErr w:type="spellStart"/>
+      <w:r>
+        <w:rPr>
+          <w:rFonts w:asciiTheme="majorHAnsi" w:hAnsiTheme="majorHAnsi"/>
+          <w:highlight w:val="yellow"/>
+        </w:rPr>
+        <w:t>lata</w:t>
+      </w:r>
+      <w:proofErr w:type="spellEnd"/>
+      <w:r>
+        <w:rPr>
+          <w:rFonts w:asciiTheme="majorHAnsi" w:hAnsiTheme="majorHAnsi"/>
+          <w:highlight w:val="yellow"/>
+        </w:rPr>
+        <w:t xml:space="preserve"> and P. </w:t>
+      </w:r>
+      <w:proofErr w:type="spellStart"/>
+      <w:r>
+        <w:rPr>
+          <w:rFonts w:asciiTheme="majorHAnsi" w:hAnsiTheme="majorHAnsi"/>
+          <w:highlight w:val="yellow"/>
+        </w:rPr>
+        <w:t>cribrata</w:t>
+      </w:r>
+      <w:proofErr w:type="spellEnd"/>
+      <w:r>
+        <w:rPr>
+          <w:rFonts w:asciiTheme="majorHAnsi" w:hAnsiTheme="majorHAnsi"/>
+          <w:highlight w:val="yellow"/>
+        </w:rPr>
+        <w:t xml:space="preserve">, which is from Adams et al 2024. </w:t>
       </w:r>
     </w:p>
     <w:p>
       <w:pPr>
-        <w:pStyle w:val="ListParagraph"/>
-        <w:numPr>
-          <w:ilvl w:val="0"/>
-          <w:numId w:val="16"/>
-        </w:numPr>
         <w:jc w:val="both"/>
         <w:rPr>
           <w:rFonts w:asciiTheme="majorHAnsi" w:hAnsiTheme="majorHAnsi"/>
-          <w:bCs/>
-        </w:rPr>
-      </w:pPr>
-      <w:r>
-        <w:rPr>
-          <w:rFonts w:asciiTheme="majorHAnsi" w:hAnsiTheme="majorHAnsi"/>
-          <w:bCs/>
-        </w:rPr>
-        <w:t>Insert length distribution</w:t>
+          <w:highlight w:val="yellow"/>
+        </w:rPr>
+      </w:pPr>
+      <w:r>
+        <w:rPr>
+          <w:rFonts w:asciiTheme="majorHAnsi" w:hAnsiTheme="majorHAnsi"/>
+          <w:highlight w:val="yellow"/>
+        </w:rPr>
+        <w:t>Comment 1: Could add numbers of genic vs intergenic to (A)</w:t>
       </w:r>
     </w:p>
     <w:p>
       <w:pPr>
-        <w:pStyle w:val="ListParagraph"/>
-        <w:numPr>
-          <w:ilvl w:val="1"/>
-          <w:numId w:val="16"/>
-        </w:numPr>
         <w:jc w:val="both"/>
         <w:rPr>
           <w:rFonts w:asciiTheme="majorHAnsi" w:hAnsiTheme="majorHAnsi"/>
-          <w:bCs/>
-        </w:rPr>
-      </w:pPr>
-      <w:r>
-        <w:rPr>
-          <w:rFonts w:asciiTheme="majorHAnsi" w:hAnsiTheme="majorHAnsi"/>
-          <w:bCs/>
-        </w:rPr>
-        <w:t>Separate lengths for recent vs ancestral</w:t>
-      </w:r>
+          <w:highlight w:val="yellow"/>
+        </w:rPr>
+      </w:pPr>
     </w:p>
     <w:p>
       <w:pPr>
-        <w:pStyle w:val="ListParagraph"/>
-        <w:numPr>
-          <w:ilvl w:val="0"/>
-          <w:numId w:val="16"/>
-        </w:numPr>
         <w:jc w:val="both"/>
         <w:rPr>
           <w:rFonts w:asciiTheme="majorHAnsi" w:hAnsiTheme="majorHAnsi"/>
-          <w:bCs/>
-        </w:rPr>
-      </w:pPr>
-      <w:r>
-        <w:rPr>
-          <w:rFonts w:asciiTheme="majorHAnsi" w:hAnsiTheme="majorHAnsi"/>
-          <w:bCs/>
-        </w:rPr>
-        <w:t xml:space="preserve">Where they </w:t>
-      </w:r>
-      <w:r>
-        <w:rPr>
-          <w:rFonts w:asciiTheme="majorHAnsi" w:hAnsiTheme="majorHAnsi"/>
-          <w:bCs/>
-        </w:rPr>
-        <w:t>derive from in</w:t>
-      </w:r>
-      <w:r>
-        <w:rPr>
-          <w:rFonts w:asciiTheme="majorHAnsi" w:hAnsiTheme="majorHAnsi"/>
-          <w:bCs/>
-        </w:rPr>
-        <w:t xml:space="preserve"> </w:t>
-      </w:r>
-      <w:r>
-        <w:rPr>
-          <w:rFonts w:asciiTheme="majorHAnsi" w:hAnsiTheme="majorHAnsi"/>
-          <w:bCs/>
-        </w:rPr>
-        <w:t xml:space="preserve">the </w:t>
-      </w:r>
-      <w:proofErr w:type="spellStart"/>
-      <w:r>
-        <w:rPr>
-          <w:rFonts w:asciiTheme="majorHAnsi" w:hAnsiTheme="majorHAnsi"/>
-          <w:bCs/>
-        </w:rPr>
-        <w:t>Blatta</w:t>
-      </w:r>
-      <w:r>
-        <w:rPr>
-          <w:rFonts w:asciiTheme="majorHAnsi" w:hAnsiTheme="majorHAnsi"/>
-          <w:bCs/>
-        </w:rPr>
-        <w:t>bacterium</w:t>
-      </w:r>
-      <w:proofErr w:type="spellEnd"/>
-      <w:r>
-        <w:rPr>
-          <w:rFonts w:asciiTheme="majorHAnsi" w:hAnsiTheme="majorHAnsi"/>
-          <w:bCs/>
-        </w:rPr>
-        <w:t xml:space="preserve"> genome</w:t>
+          <w:highlight w:val="yellow"/>
+        </w:rPr>
+      </w:pPr>
+      <w:r>
+        <w:rPr>
+          <w:rFonts w:asciiTheme="majorHAnsi" w:hAnsiTheme="majorHAnsi"/>
+          <w:highlight w:val="yellow"/>
+        </w:rPr>
+        <w:t>B. The plot starts at 50 bp, as this was the minimum. I have a maximum cutoff of 1000 bp (75 of the 41103 markers have been excluded).</w:t>
       </w:r>
     </w:p>
     <w:p>
@@ -7209,8 +7157,122 @@
         <w:jc w:val="both"/>
         <w:rPr>
           <w:rFonts w:asciiTheme="majorHAnsi" w:hAnsiTheme="majorHAnsi"/>
-        </w:rPr>
-      </w:pPr>
+          <w:highlight w:val="yellow"/>
+        </w:rPr>
+      </w:pPr>
+      <w:r>
+        <w:rPr>
+          <w:rFonts w:asciiTheme="majorHAnsi" w:hAnsiTheme="majorHAnsi"/>
+          <w:highlight w:val="yellow"/>
+        </w:rPr>
+        <w:t xml:space="preserve">Comment 1: I’m not sure why there are 2 peaks… I can of course fiddle around with the resolution of this graph and flatten out the 2 peaks (not to be dodgy, but just a </w:t>
+      </w:r>
+      <w:proofErr w:type="gramStart"/>
+      <w:r>
+        <w:rPr>
+          <w:rFonts w:asciiTheme="majorHAnsi" w:hAnsiTheme="majorHAnsi"/>
+          <w:highlight w:val="yellow"/>
+        </w:rPr>
+        <w:t>more coarse</w:t>
+      </w:r>
+      <w:proofErr w:type="gramEnd"/>
+      <w:r>
+        <w:rPr>
+          <w:rFonts w:asciiTheme="majorHAnsi" w:hAnsiTheme="majorHAnsi"/>
+          <w:highlight w:val="yellow"/>
+        </w:rPr>
+        <w:t xml:space="preserve"> summary of the lengths)</w:t>
+      </w:r>
+    </w:p>
+    <w:p>
+      <w:pPr>
+        <w:jc w:val="both"/>
+        <w:rPr>
+          <w:rFonts w:asciiTheme="majorHAnsi" w:hAnsiTheme="majorHAnsi"/>
+          <w:highlight w:val="yellow"/>
+        </w:rPr>
+      </w:pPr>
+      <w:r>
+        <w:rPr>
+          <w:rFonts w:asciiTheme="majorHAnsi" w:hAnsiTheme="majorHAnsi"/>
+          <w:highlight w:val="yellow"/>
+        </w:rPr>
+        <w:t>Comment 2: I’m hoping to add 2 additional curves to the plot (or as additional plots) – 1 for genic and 1 for intergenic.</w:t>
+      </w:r>
+    </w:p>
+    <w:p>
+      <w:pPr>
+        <w:jc w:val="both"/>
+        <w:rPr>
+          <w:rFonts w:asciiTheme="majorHAnsi" w:hAnsiTheme="majorHAnsi"/>
+          <w:highlight w:val="yellow"/>
+        </w:rPr>
+      </w:pPr>
+    </w:p>
+    <w:p>
+      <w:pPr>
+        <w:jc w:val="both"/>
+        <w:rPr>
+          <w:rFonts w:asciiTheme="majorHAnsi" w:hAnsiTheme="majorHAnsi"/>
+        </w:rPr>
+      </w:pPr>
+      <w:r>
+        <w:rPr>
+          <w:rFonts w:asciiTheme="majorHAnsi" w:hAnsiTheme="majorHAnsi"/>
+          <w:highlight w:val="yellow"/>
+        </w:rPr>
+        <w:t>C. Placeholder for Leo figure</w:t>
+      </w:r>
+    </w:p>
+    <w:p>
+      <w:pPr>
+        <w:jc w:val="both"/>
+        <w:rPr>
+          <w:rFonts w:asciiTheme="majorHAnsi" w:hAnsiTheme="majorHAnsi"/>
+        </w:rPr>
+      </w:pPr>
+    </w:p>
+    <w:p>
+      <w:pPr>
+        <w:jc w:val="both"/>
+        <w:rPr>
+          <w:rFonts w:asciiTheme="majorHAnsi" w:hAnsiTheme="majorHAnsi"/>
+        </w:rPr>
+      </w:pPr>
+      <w:r>
+        <w:rPr>
+          <w:rFonts w:asciiTheme="majorHAnsi" w:hAnsiTheme="majorHAnsi"/>
+        </w:rPr>
+        <w:t>Figure 2. Or old inserts?</w:t>
+      </w:r>
+    </w:p>
+    <w:p>
+      <w:pPr>
+        <w:jc w:val="both"/>
+        <w:rPr>
+          <w:rFonts w:asciiTheme="majorHAnsi" w:hAnsiTheme="majorHAnsi"/>
+        </w:rPr>
+      </w:pPr>
+      <w:r>
+        <w:rPr>
+          <w:rFonts w:asciiTheme="majorHAnsi" w:hAnsiTheme="majorHAnsi"/>
+        </w:rPr>
+        <w:t xml:space="preserve">Could swap with </w:t>
+      </w:r>
+      <w:proofErr w:type="spellStart"/>
+      <w:r>
+        <w:rPr>
+          <w:rFonts w:asciiTheme="majorHAnsi" w:hAnsiTheme="majorHAnsi"/>
+        </w:rPr>
+        <w:t>Zhuzhi’s</w:t>
+      </w:r>
+      <w:proofErr w:type="spellEnd"/>
+      <w:r>
+        <w:rPr>
+          <w:rFonts w:asciiTheme="majorHAnsi" w:hAnsiTheme="majorHAnsi"/>
+        </w:rPr>
+        <w:t xml:space="preserve"> chimera story?</w:t>
+      </w:r>
     </w:p>
     <w:p>
       <w:pPr>
@@ -7456,6 +7518,7 @@
         <w:rPr>
           <w:rFonts w:asciiTheme="majorHAnsi" w:hAnsiTheme="majorHAnsi"/>
         </w:rPr>
+        <w:lastRenderedPageBreak/>
         <w:t>Keeling, P. J. (2024). Horizontal gene transfer in eukaryotes: aligning theory with data. Nature Reviews Genetics, 1-15.</w:t>
       </w:r>
       <w:r>
@@ -7464,7 +7527,7 @@
         </w:rPr>
         <w:br/>
       </w:r>
-      <w:hyperlink r:id="rId9" w:history="1">
+      <w:hyperlink r:id="rId11" w:history="1">
         <w:r>
           <w:rPr>
             <w:rStyle w:val="Hyperlink"/>
@@ -7644,7 +7707,7 @@
         </w:rPr>
         <w:br/>
       </w:r>
-      <w:hyperlink r:id="rId10" w:history="1">
+      <w:hyperlink r:id="rId12" w:history="1">
         <w:r>
           <w:rPr>
             <w:rStyle w:val="Hyperlink"/>
@@ -7715,7 +7778,7 @@
         </w:rPr>
         <w:br/>
       </w:r>
-      <w:hyperlink r:id="rId11" w:history="1">
+      <w:hyperlink r:id="rId13" w:history="1">
         <w:r>
           <w:rPr>
             <w:rStyle w:val="Hyperlink"/>
@@ -7741,7 +7804,6 @@
         <w:rPr>
           <w:rFonts w:asciiTheme="majorHAnsi" w:hAnsiTheme="majorHAnsi"/>
         </w:rPr>
-        <w:lastRenderedPageBreak/>
         <w:t>Ewart, K. M., Ho, S. Y., Chowdhury, A. A., Jaya, F. R., Kinjo, Y., Bennett, J., ... &amp; Lo, N. (2024). Pervasive relaxed selection in termite genomes. Proceedings of the Royal Society B, 291(2023), 20232439.</w:t>
       </w:r>
       <w:r>
@@ -7822,7 +7884,7 @@
         </w:rPr>
         <w:br/>
       </w:r>
-      <w:hyperlink r:id="rId12" w:history="1">
+      <w:hyperlink r:id="rId14" w:history="1">
         <w:r>
           <w:rPr>
             <w:rStyle w:val="Hyperlink"/>
@@ -7872,7 +7934,7 @@
         </w:rPr>
         <w:br/>
       </w:r>
-      <w:hyperlink r:id="rId13" w:history="1">
+      <w:hyperlink r:id="rId15" w:history="1">
         <w:r>
           <w:rPr>
             <w:rStyle w:val="Hyperlink"/>
@@ -7956,7 +8018,7 @@
         </w:rPr>
         <w:br/>
       </w:r>
-      <w:hyperlink r:id="rId14" w:history="1">
+      <w:hyperlink r:id="rId16" w:history="1">
         <w:r>
           <w:rPr>
             <w:rStyle w:val="Hyperlink"/>
@@ -8051,7 +8113,7 @@
 </file>
 
 <file path=word/comments.xml><?xml version="1.0" encoding="utf-8"?>
-<w:comments xmlns:wpc="http://schemas.microsoft.com/office/word/2010/wordprocessingCanvas" xmlns:cx="http://schemas.microsoft.com/office/drawing/2014/chartex" xmlns:cx1="http://schemas.microsoft.com/office/drawing/2015/9/8/chartex" xmlns:cx2="http://schemas.microsoft.com/office/drawing/2015/10/21/chartex" xmlns:cx3="http://schemas.microsoft.com/office/drawing/2016/5/9/chartex" xmlns:cx4="http://schemas.microsoft.com/office/drawing/2016/5/10/chartex" xmlns:cx5="http://schemas.microsoft.com/office/drawing/2016/5/11/chartex" xmlns:cx6="http://schemas.microsoft.com/office/drawing/2016/5/12/chartex" xmlns:cx7="http://schemas.microsoft.com/office/drawing/2016/5/13/chartex" xmlns:cx8="http://schemas.microsoft.com/office/drawing/2016/5/14/chartex" xmlns:mc="http://schemas.openxmlformats.org/markup-compatibility/2006" xmlns:aink="http://schemas.microsoft.com/office/drawing/2016/ink" xmlns:am3d="http://schemas.microsoft.com/office/drawing/2017/model3d" xmlns:o="urn:schemas-microsoft-com:office:office" xmlns:r="http://schemas.openxmlformats.org/officeDocument/2006/relationships" xmlns:m="http://schemas.openxmlformats.org/officeDocument/2006/math" xmlns:v="urn:schemas-microsoft-com:vml" xmlns:wp14="http://schemas.microsoft.com/office/word/2010/wordprocessingDrawing" xmlns:wp="http://schemas.openxmlformats.org/drawingml/2006/wordprocessingDrawing" xmlns:w10="urn:schemas-microsoft-com:office:word" xmlns:w="http://schemas.openxmlformats.org/wordprocessingml/2006/main" xmlns:w14="http://schemas.microsoft.com/office/word/2010/wordml" xmlns:w15="http://schemas.microsoft.com/office/word/2012/wordml" xmlns:w16cid="http://schemas.microsoft.com/office/word/2016/wordml/cid" xmlns:w16se="http://schemas.microsoft.com/office/word/2015/wordml/symex" xmlns:wpg="http://schemas.microsoft.com/office/word/2010/wordprocessingGroup" xmlns:wpi="http://schemas.microsoft.com/office/word/2010/wordprocessingInk" xmlns:wne="http://schemas.microsoft.com/office/word/2006/wordml" xmlns:wps="http://schemas.microsoft.com/office/word/2010/wordprocessingShape" mc:Ignorable="w14 w15 w16se w16cid wp14">
+<w:comments xmlns:wpc="http://schemas.microsoft.com/office/word/2010/wordprocessingCanvas" xmlns:cx="http://schemas.microsoft.com/office/drawing/2014/chartex" xmlns:cx1="http://schemas.microsoft.com/office/drawing/2015/9/8/chartex" xmlns:cx2="http://schemas.microsoft.com/office/drawing/2015/10/21/chartex" xmlns:cx3="http://schemas.microsoft.com/office/drawing/2016/5/9/chartex" xmlns:cx4="http://schemas.microsoft.com/office/drawing/2016/5/10/chartex" xmlns:cx5="http://schemas.microsoft.com/office/drawing/2016/5/11/chartex" xmlns:cx6="http://schemas.microsoft.com/office/drawing/2016/5/12/chartex" xmlns:cx7="http://schemas.microsoft.com/office/drawing/2016/5/13/chartex" xmlns:cx8="http://schemas.microsoft.com/office/drawing/2016/5/14/chartex" xmlns:mc="http://schemas.openxmlformats.org/markup-compatibility/2006" xmlns:aink="http://schemas.microsoft.com/office/drawing/2016/ink" xmlns:am3d="http://schemas.microsoft.com/office/drawing/2017/model3d" xmlns:o="urn:schemas-microsoft-com:office:office" xmlns:oel="http://schemas.microsoft.com/office/2019/extlst" xmlns:r="http://schemas.openxmlformats.org/officeDocument/2006/relationships" xmlns:m="http://schemas.openxmlformats.org/officeDocument/2006/math" xmlns:v="urn:schemas-microsoft-com:vml" xmlns:wp14="http://schemas.microsoft.com/office/word/2010/wordprocessingDrawing" xmlns:wp="http://schemas.openxmlformats.org/drawingml/2006/wordprocessingDrawing" xmlns:w10="urn:schemas-microsoft-com:office:word" xmlns:w="http://schemas.openxmlformats.org/wordprocessingml/2006/main" xmlns:w14="http://schemas.microsoft.com/office/word/2010/wordml" xmlns:w15="http://schemas.microsoft.com/office/word/2012/wordml" xmlns:w16cex="http://schemas.microsoft.com/office/word/2018/wordml/cex" xmlns:w16cid="http://schemas.microsoft.com/office/word/2016/wordml/cid" xmlns:w16="http://schemas.microsoft.com/office/word/2018/wordml" xmlns:w16du="http://schemas.microsoft.com/office/word/2023/wordml/word16du" xmlns:w16sdtdh="http://schemas.microsoft.com/office/word/2020/wordml/sdtdatahash" xmlns:w16sdtfl="http://schemas.microsoft.com/office/word/2024/wordml/sdtformatlock" xmlns:w16se="http://schemas.microsoft.com/office/word/2015/wordml/symex" xmlns:wpg="http://schemas.microsoft.com/office/word/2010/wordprocessingGroup" xmlns:wpi="http://schemas.microsoft.com/office/word/2010/wordprocessingInk" xmlns:wne="http://schemas.microsoft.com/office/word/2006/wordml" xmlns:wps="http://schemas.microsoft.com/office/word/2010/wordprocessingShape" mc:Ignorable="w14 w15 w16se w16cid w16 w16cex w16sdtdh w16sdtfl w16du wp14">
   <w:comment w:id="0" w:author="Microsoft Office User" w:date="2025-10-27T21:15:00Z" w:initials="MOU">
     <w:p>
       <w:pPr>
@@ -8080,7 +8142,10 @@
         <w:annotationRef/>
       </w:r>
       <w:r>
-        <w:t xml:space="preserve">Based on the node age of all </w:t>
+        <w:t>This is b</w:t>
+      </w:r>
+      <w:r>
+        <w:t xml:space="preserve">ased on the node age of all </w:t>
       </w:r>
       <w:proofErr w:type="spellStart"/>
       <w:r>
@@ -8096,27 +8161,22 @@
       </w:r>
       <w:proofErr w:type="spellEnd"/>
       <w:r>
-        <w:t xml:space="preserve">. Though there may be some homologous B. </w:t>
+        <w:t xml:space="preserve">. Though there may be some homologous B. germanica, P. americana or even some termite inserts that would increase this dramatically. </w:t>
+      </w:r>
+      <w:r>
+        <w:t xml:space="preserve">I don’t believe they passed a manual audit (i.e. checking their synteny), but I believe this is getting double checked (by </w:t>
       </w:r>
       <w:proofErr w:type="spellStart"/>
       <w:r>
-        <w:t>germanica</w:t>
+        <w:t>Zhuzhi</w:t>
       </w:r>
       <w:proofErr w:type="spellEnd"/>
       <w:r>
-        <w:t xml:space="preserve">, P. </w:t>
-      </w:r>
-      <w:proofErr w:type="spellStart"/>
-      <w:r>
-        <w:t>americana</w:t>
-      </w:r>
-      <w:proofErr w:type="spellEnd"/>
-      <w:r>
-        <w:t xml:space="preserve"> or even some termite inserts that would increase this dramatically. </w:t>
+        <w:t>?)</w:t>
       </w:r>
     </w:p>
   </w:comment>
-  <w:comment w:id="2" w:author="Microsoft Office User" w:date="2025-10-27T21:23:00Z" w:initials="MOU">
+  <w:comment w:id="2" w:author="Microsoft Office User" w:date="2025-10-17T10:44:00Z" w:initials="MOU">
     <w:p>
       <w:pPr>
         <w:pStyle w:val="CommentText"/>
@@ -8127,29 +8187,13 @@
         </w:rPr>
         <w:annotationRef/>
       </w:r>
-      <w:r>
-        <w:rPr>
-          <w:b/>
-          <w:bCs/>
-        </w:rPr>
-        <w:t>KYLE NOW:</w:t>
-      </w:r>
-      <w:r>
-        <w:t xml:space="preserve"> </w:t>
-      </w:r>
-      <w:r>
-        <w:t xml:space="preserve">Update when I’ve </w:t>
-      </w:r>
-      <w:r>
-        <w:t xml:space="preserve">made updates based on </w:t>
-      </w:r>
       <w:proofErr w:type="spellStart"/>
       <w:r>
-        <w:t>Zhuzhi’s</w:t>
+        <w:t>Zhuzhi</w:t>
       </w:r>
       <w:proofErr w:type="spellEnd"/>
       <w:r>
-        <w:t xml:space="preserve"> thesis.</w:t>
+        <w:t xml:space="preserve"> to update</w:t>
       </w:r>
     </w:p>
   </w:comment>
@@ -8164,17 +8208,20 @@
         </w:rPr>
         <w:annotationRef/>
       </w:r>
+      <w:r>
+        <w:t xml:space="preserve">Do we have these data somewhere? Do we have </w:t>
+      </w:r>
       <w:proofErr w:type="spellStart"/>
       <w:r>
-        <w:t>Zhuzhi</w:t>
+        <w:t>mosdepth</w:t>
       </w:r>
       <w:proofErr w:type="spellEnd"/>
       <w:r>
-        <w:t xml:space="preserve"> to update</w:t>
+        <w:t xml:space="preserve"> results from the original bam files?</w:t>
       </w:r>
     </w:p>
   </w:comment>
-  <w:comment w:id="4" w:author="Microsoft Office User" w:date="2025-10-17T10:44:00Z" w:initials="MOU">
+  <w:comment w:id="4" w:author="Microsoft Office User" w:date="2025-09-19T12:07:00Z" w:initials="MOU">
     <w:p>
       <w:pPr>
         <w:pStyle w:val="CommentText"/>
@@ -8186,19 +8233,11 @@
         <w:annotationRef/>
       </w:r>
       <w:r>
-        <w:t xml:space="preserve">Do we have these data somewhere? Do we have </w:t>
-      </w:r>
-      <w:proofErr w:type="spellStart"/>
-      <w:r>
-        <w:t>mosdepth</w:t>
-      </w:r>
-      <w:proofErr w:type="spellEnd"/>
-      <w:r>
-        <w:t xml:space="preserve"> results from the original bam files?</w:t>
+        <w:t>Leo to confirm and possible add a p-value.</w:t>
       </w:r>
     </w:p>
   </w:comment>
-  <w:comment w:id="5" w:author="Microsoft Office User" w:date="2025-09-19T12:07:00Z" w:initials="MOU">
+  <w:comment w:id="5" w:author="Kyle Ewart" w:date="2025-10-28T16:13:00Z" w:initials="KE">
     <w:p>
       <w:pPr>
         <w:pStyle w:val="CommentText"/>
@@ -8210,7 +8249,7 @@
         <w:annotationRef/>
       </w:r>
       <w:r>
-        <w:t>Leo to confirm and possible add a p-value.</w:t>
+        <w:t>Maxim – do you have these numbers/tables?</w:t>
       </w:r>
     </w:p>
   </w:comment>
@@ -8264,24 +8303,11 @@
         <w:annotationRef/>
       </w:r>
       <w:r>
-        <w:t xml:space="preserve">Though I’m not sure if we’ve completely excluded the ancestral P. </w:t>
-      </w:r>
-      <w:proofErr w:type="spellStart"/>
-      <w:r>
-        <w:t>a</w:t>
-      </w:r>
-      <w:r>
-        <w:t>mericana</w:t>
-      </w:r>
-      <w:proofErr w:type="spellEnd"/>
-      <w:r>
-        <w:t xml:space="preserve">/B. </w:t>
-      </w:r>
-      <w:proofErr w:type="spellStart"/>
-      <w:r>
-        <w:t>germanica</w:t>
-      </w:r>
-      <w:proofErr w:type="spellEnd"/>
+        <w:t>Though I’m not sure if we’ve completely excluded the ancestral P. a</w:t>
+      </w:r>
+      <w:r>
+        <w:t>mericana/B. germanica</w:t>
+      </w:r>
       <w:r>
         <w:t xml:space="preserve"> inserts…</w:t>
       </w:r>
@@ -8327,7 +8353,15 @@
         <w:annotationRef/>
       </w:r>
       <w:r>
-        <w:t>If we don’t have a number we can be more general here.</w:t>
+        <w:t xml:space="preserve">If we don’t have a </w:t>
+      </w:r>
+      <w:proofErr w:type="gramStart"/>
+      <w:r>
+        <w:t>number</w:t>
+      </w:r>
+      <w:proofErr w:type="gramEnd"/>
+      <w:r>
+        <w:t xml:space="preserve"> we can be more general here.</w:t>
       </w:r>
     </w:p>
   </w:comment>
@@ -8348,10 +8382,15 @@
       </w:r>
       <w:proofErr w:type="spellEnd"/>
       <w:r>
-        <w:t xml:space="preserve"> to add. </w:t>
-      </w:r>
-      <w:r>
-        <w:t>If we don’t have a number we can be more general here.</w:t>
+        <w:t xml:space="preserve"> to add. If we don’t have a </w:t>
+      </w:r>
+      <w:proofErr w:type="gramStart"/>
+      <w:r>
+        <w:t>number</w:t>
+      </w:r>
+      <w:proofErr w:type="gramEnd"/>
+      <w:r>
+        <w:t xml:space="preserve"> we can be more general here.</w:t>
       </w:r>
     </w:p>
   </w:comment>
@@ -8451,7 +8490,7 @@
       </w:r>
     </w:p>
   </w:comment>
-  <w:comment w:id="16" w:author="Microsoft Office User" w:date="2025-10-27T21:44:00Z" w:initials="MOU">
+  <w:comment w:id="16" w:author="Kyle Ewart" w:date="2025-10-28T16:15:00Z" w:initials="KE">
     <w:p>
       <w:pPr>
         <w:pStyle w:val="CommentText"/>
@@ -8463,11 +8502,27 @@
         <w:annotationRef/>
       </w:r>
       <w:r>
-        <w:t>Is this right?</w:t>
+        <w:t>Please add (whoever has these data), or please send the bed files of these inserts.</w:t>
       </w:r>
     </w:p>
   </w:comment>
-  <w:comment w:id="17" w:author="Maxim Warwick Dus Adams" w:date="2025-09-05T13:43:00Z" w:initials="MA">
+  <w:comment w:id="17" w:author="Microsoft Office User" w:date="2025-10-27T21:44:00Z" w:initials="MOU">
+    <w:p>
+      <w:pPr>
+        <w:pStyle w:val="CommentText"/>
+      </w:pPr>
+      <w:r>
+        <w:rPr>
+          <w:rStyle w:val="CommentReference"/>
+        </w:rPr>
+        <w:annotationRef/>
+      </w:r>
+      <w:r>
+        <w:t>Is this right?</w:t>
+      </w:r>
+    </w:p>
+  </w:comment>
+  <w:comment w:id="18" w:author="Maxim Warwick Dus Adams" w:date="2025-09-05T13:43:00Z" w:initials="MA">
     <w:p>
       <w:r>
         <w:rPr>
@@ -8480,16 +8535,7 @@
           <w:sz w:val="20"/>
           <w:szCs w:val="20"/>
         </w:rPr>
-        <w:t xml:space="preserve">I believe there are more chimeras than this – if you could send me the </w:t>
-      </w:r>
-      <w:bookmarkStart w:id="18" w:name="_GoBack"/>
-      <w:bookmarkEnd w:id="18"/>
-      <w:r>
-        <w:rPr>
-          <w:sz w:val="20"/>
-          <w:szCs w:val="20"/>
-        </w:rPr>
-        <w:t>updated lists I will blast all of them</w:t>
+        <w:t>I believe there are more chimeras than this – if you could send me the updated lists I will blast all of them</w:t>
       </w:r>
     </w:p>
   </w:comment>
@@ -8593,13 +8639,8 @@
         <w:annotationRef/>
       </w:r>
       <w:r>
-        <w:t xml:space="preserve">Can you please add this table whoever has these </w:t>
-      </w:r>
-      <w:proofErr w:type="gramStart"/>
-      <w:r>
-        <w:t>data</w:t>
-      </w:r>
-      <w:proofErr w:type="gramEnd"/>
+        <w:t>Can you please add this table whoever has these data</w:t>
+      </w:r>
     </w:p>
   </w:comment>
   <w:comment w:id="25" w:author="Microsoft Office User" w:date="2025-09-03T20:22:00Z" w:initials="MOU">
@@ -8671,40 +8712,6 @@
           <w:szCs w:val="14"/>
         </w:rPr>
         <w:t xml:space="preserve">DOI: 10.1534/genetics.108.091538 </w:t>
-      </w:r>
-    </w:p>
-  </w:comment>
-  <w:comment w:id="29" w:author="Maxim Warwick Dus Adams" w:date="2025-07-18T10:19:00Z" w:initials="MA">
-    <w:p>
-      <w:r>
-        <w:rPr>
-          <w:rStyle w:val="CommentReference"/>
-        </w:rPr>
-        <w:annotationRef/>
-      </w:r>
-      <w:r>
-        <w:rPr>
-          <w:sz w:val="20"/>
-          <w:szCs w:val="20"/>
-        </w:rPr>
-        <w:t>These choices seem very solid to me</w:t>
-      </w:r>
-    </w:p>
-  </w:comment>
-  <w:comment w:id="30" w:author="Maxim Warwick Dus Adams" w:date="2025-07-18T10:19:00Z" w:initials="MA">
-    <w:p>
-      <w:r>
-        <w:rPr>
-          <w:rStyle w:val="CommentReference"/>
-        </w:rPr>
-        <w:annotationRef/>
-      </w:r>
-      <w:r>
-        <w:rPr>
-          <w:sz w:val="20"/>
-          <w:szCs w:val="20"/>
-        </w:rPr>
-        <w:t>If we wanted to style it up a little I'd be happy to do some scientific illustrations of panesthiine vs p. americana vs termites to add</w:t>
       </w:r>
     </w:p>
   </w:comment>
@@ -8712,13 +8719,13 @@
 </file>
 
 <file path=word/commentsExtended.xml><?xml version="1.0" encoding="utf-8"?>
-<w15:commentsEx xmlns:wpc="http://schemas.microsoft.com/office/word/2010/wordprocessingCanvas" xmlns:cx="http://schemas.microsoft.com/office/drawing/2014/chartex" xmlns:cx1="http://schemas.microsoft.com/office/drawing/2015/9/8/chartex" xmlns:cx2="http://schemas.microsoft.com/office/drawing/2015/10/21/chartex" xmlns:cx3="http://schemas.microsoft.com/office/drawing/2016/5/9/chartex" xmlns:cx4="http://schemas.microsoft.com/office/drawing/2016/5/10/chartex" xmlns:cx5="http://schemas.microsoft.com/office/drawing/2016/5/11/chartex" xmlns:cx6="http://schemas.microsoft.com/office/drawing/2016/5/12/chartex" xmlns:cx7="http://schemas.microsoft.com/office/drawing/2016/5/13/chartex" xmlns:cx8="http://schemas.microsoft.com/office/drawing/2016/5/14/chartex" xmlns:mc="http://schemas.openxmlformats.org/markup-compatibility/2006" xmlns:aink="http://schemas.microsoft.com/office/drawing/2016/ink" xmlns:am3d="http://schemas.microsoft.com/office/drawing/2017/model3d" xmlns:o="urn:schemas-microsoft-com:office:office" xmlns:r="http://schemas.openxmlformats.org/officeDocument/2006/relationships" xmlns:m="http://schemas.openxmlformats.org/officeDocument/2006/math" xmlns:v="urn:schemas-microsoft-com:vml" xmlns:wp14="http://schemas.microsoft.com/office/word/2010/wordprocessingDrawing" xmlns:wp="http://schemas.openxmlformats.org/drawingml/2006/wordprocessingDrawing" xmlns:w10="urn:schemas-microsoft-com:office:word" xmlns:w="http://schemas.openxmlformats.org/wordprocessingml/2006/main" xmlns:w14="http://schemas.microsoft.com/office/word/2010/wordml" xmlns:w15="http://schemas.microsoft.com/office/word/2012/wordml" xmlns:w16cid="http://schemas.microsoft.com/office/word/2016/wordml/cid" xmlns:w16se="http://schemas.microsoft.com/office/word/2015/wordml/symex" xmlns:wpg="http://schemas.microsoft.com/office/word/2010/wordprocessingGroup" xmlns:wpi="http://schemas.microsoft.com/office/word/2010/wordprocessingInk" xmlns:wne="http://schemas.microsoft.com/office/word/2006/wordml" xmlns:wps="http://schemas.microsoft.com/office/word/2010/wordprocessingShape" mc:Ignorable="w14 w15 w16se w16cid wp14">
+<w15:commentsEx xmlns:wpc="http://schemas.microsoft.com/office/word/2010/wordprocessingCanvas" xmlns:cx="http://schemas.microsoft.com/office/drawing/2014/chartex" xmlns:cx1="http://schemas.microsoft.com/office/drawing/2015/9/8/chartex" xmlns:cx2="http://schemas.microsoft.com/office/drawing/2015/10/21/chartex" xmlns:cx3="http://schemas.microsoft.com/office/drawing/2016/5/9/chartex" xmlns:cx4="http://schemas.microsoft.com/office/drawing/2016/5/10/chartex" xmlns:cx5="http://schemas.microsoft.com/office/drawing/2016/5/11/chartex" xmlns:cx6="http://schemas.microsoft.com/office/drawing/2016/5/12/chartex" xmlns:cx7="http://schemas.microsoft.com/office/drawing/2016/5/13/chartex" xmlns:cx8="http://schemas.microsoft.com/office/drawing/2016/5/14/chartex" xmlns:mc="http://schemas.openxmlformats.org/markup-compatibility/2006" xmlns:aink="http://schemas.microsoft.com/office/drawing/2016/ink" xmlns:am3d="http://schemas.microsoft.com/office/drawing/2017/model3d" xmlns:o="urn:schemas-microsoft-com:office:office" xmlns:oel="http://schemas.microsoft.com/office/2019/extlst" xmlns:r="http://schemas.openxmlformats.org/officeDocument/2006/relationships" xmlns:m="http://schemas.openxmlformats.org/officeDocument/2006/math" xmlns:v="urn:schemas-microsoft-com:vml" xmlns:wp14="http://schemas.microsoft.com/office/word/2010/wordprocessingDrawing" xmlns:wp="http://schemas.openxmlformats.org/drawingml/2006/wordprocessingDrawing" xmlns:w10="urn:schemas-microsoft-com:office:word" xmlns:w="http://schemas.openxmlformats.org/wordprocessingml/2006/main" xmlns:w14="http://schemas.microsoft.com/office/word/2010/wordml" xmlns:w15="http://schemas.microsoft.com/office/word/2012/wordml" xmlns:w16cex="http://schemas.microsoft.com/office/word/2018/wordml/cex" xmlns:w16cid="http://schemas.microsoft.com/office/word/2016/wordml/cid" xmlns:w16="http://schemas.microsoft.com/office/word/2018/wordml" xmlns:w16du="http://schemas.microsoft.com/office/word/2023/wordml/word16du" xmlns:w16sdtdh="http://schemas.microsoft.com/office/word/2020/wordml/sdtdatahash" xmlns:w16sdtfl="http://schemas.microsoft.com/office/word/2024/wordml/sdtformatlock" xmlns:w16se="http://schemas.microsoft.com/office/word/2015/wordml/symex" xmlns:wpg="http://schemas.microsoft.com/office/word/2010/wordprocessingGroup" xmlns:wpi="http://schemas.microsoft.com/office/word/2010/wordprocessingInk" xmlns:wne="http://schemas.microsoft.com/office/word/2006/wordml" xmlns:wps="http://schemas.microsoft.com/office/word/2010/wordprocessingShape" mc:Ignorable="w14 w15 w16se w16cid w16 w16cex w16sdtdh w16sdtfl w16du wp14">
   <w15:commentEx w15:paraId="0804FAE7" w15:done="0"/>
   <w15:commentEx w15:paraId="004DD2FA" w15:done="0"/>
-  <w15:commentEx w15:paraId="40D530F5" w15:done="0"/>
   <w15:commentEx w15:paraId="408757E6" w15:done="0"/>
   <w15:commentEx w15:paraId="3A502656" w15:done="0"/>
   <w15:commentEx w15:paraId="760C4F60" w15:done="0"/>
+  <w15:commentEx w15:paraId="25509415" w15:done="0"/>
   <w15:commentEx w15:paraId="0241FB2B" w15:done="0"/>
   <w15:commentEx w15:paraId="1ED2D972" w15:done="0"/>
   <w15:commentEx w15:paraId="1BCE38EC" w15:done="0"/>
@@ -8729,6 +8736,7 @@
   <w15:commentEx w15:paraId="05544B25" w15:paraIdParent="5AADE030" w15:done="0"/>
   <w15:commentEx w15:paraId="17D9EC1B" w15:done="0"/>
   <w15:commentEx w15:paraId="7C119C61" w15:done="0"/>
+  <w15:commentEx w15:paraId="1DB74010" w15:done="0"/>
   <w15:commentEx w15:paraId="518F3B79" w15:done="0"/>
   <w15:commentEx w15:paraId="6C6C7483" w15:done="0"/>
   <w15:commentEx w15:paraId="521F6C3D" w15:done="0"/>
@@ -8741,68 +8749,31 @@
   <w15:commentEx w15:paraId="15A20379" w15:done="0"/>
   <w15:commentEx w15:paraId="3B7D18C5" w15:done="0"/>
   <w15:commentEx w15:paraId="492C0592" w15:done="0"/>
-  <w15:commentEx w15:paraId="748384F7" w15:done="0"/>
-  <w15:commentEx w15:paraId="46CB9953" w15:paraIdParent="748384F7" w15:done="0"/>
 </w15:commentsEx>
 </file>
 
 <file path=word/commentsExtensible.xml><?xml version="1.0" encoding="utf-8"?>
-<w16cex:commentsExtensible xmlns:wpc="http://schemas.microsoft.com/office/word/2010/wordprocessingCanvas" xmlns:cx="http://schemas.microsoft.com/office/drawing/2014/chartex" xmlns:cx1="http://schemas.microsoft.com/office/drawing/2015/9/8/chartex" xmlns:cx2="http://schemas.microsoft.com/office/drawing/2015/10/21/chartex" xmlns:cx3="http://schemas.microsoft.com/office/drawing/2016/5/9/chartex" xmlns:cx4="http://schemas.microsoft.com/office/drawing/2016/5/10/chartex" xmlns:cx5="http://schemas.microsoft.com/office/drawing/2016/5/11/chartex" xmlns:cx6="http://schemas.microsoft.com/office/drawing/2016/5/12/chartex" xmlns:cx7="http://schemas.microsoft.com/office/drawing/2016/5/13/chartex" xmlns:cx8="http://schemas.microsoft.com/office/drawing/2016/5/14/chartex" xmlns:mc="http://schemas.openxmlformats.org/markup-compatibility/2006" xmlns:aink="http://schemas.microsoft.com/office/drawing/2016/ink" xmlns:am3d="http://schemas.microsoft.com/office/drawing/2017/model3d" xmlns:o="urn:schemas-microsoft-com:office:office" xmlns:oel="http://schemas.microsoft.com/office/2019/extlst" xmlns:r="http://schemas.openxmlformats.org/officeDocument/2006/relationships" xmlns:m="http://schemas.openxmlformats.org/officeDocument/2006/math" xmlns:v="urn:schemas-microsoft-com:vml" xmlns:wp14="http://schemas.microsoft.com/office/word/2010/wordprocessingDrawing" xmlns:wp="http://schemas.openxmlformats.org/drawingml/2006/wordprocessingDrawing" xmlns:w10="urn:schemas-microsoft-com:office:word" xmlns:w="http://schemas.openxmlformats.org/wordprocessingml/2006/main" xmlns:w14="http://schemas.microsoft.com/office/word/2010/wordml" xmlns:w15="http://schemas.microsoft.com/office/word/2012/wordml" xmlns:w16cex="http://schemas.microsoft.com/office/word/2018/wordml/cex" xmlns:w16cid="http://schemas.microsoft.com/office/word/2016/wordml/cid" xmlns:w16="http://schemas.microsoft.com/office/word/2018/wordml" xmlns:w16sdtdh="http://schemas.microsoft.com/office/word/2020/wordml/sdtdatahash" xmlns:w16se="http://schemas.microsoft.com/office/word/2015/wordml/symex" xmlns:wpg="http://schemas.microsoft.com/office/word/2010/wordprocessingGroup" xmlns:wpi="http://schemas.microsoft.com/office/word/2010/wordprocessingInk" xmlns:wne="http://schemas.microsoft.com/office/word/2006/wordml" xmlns:wps="http://schemas.microsoft.com/office/word/2010/wordprocessingShape" mc:Ignorable="w14 w15 w16se w16cid w16 w16cex w16sdtdh wp14">
-  <w16cex:commentExtensible w16cex:durableId="2C5C02EE" w16cex:dateUtc="2025-08-29T00:43:00Z"/>
-  <w16cex:commentExtensible w16cex:durableId="2C9B7BD9" w16cex:dateUtc="2025-10-16T03:12:00Z"/>
-  <w16cex:commentExtensible w16cex:durableId="2C9B7BFC" w16cex:dateUtc="2025-10-16T03:13:00Z"/>
-  <w16cex:commentExtensible w16cex:durableId="2C9B7C50" w16cex:dateUtc="2025-10-16T03:14:00Z"/>
-  <w16cex:commentExtensible w16cex:durableId="2C9B7CE7" w16cex:dateUtc="2025-10-16T03:17:00Z"/>
-  <w16cex:commentExtensible w16cex:durableId="2C9B7D47" w16cex:dateUtc="2025-10-16T03:18:00Z"/>
-  <w16cex:commentExtensible w16cex:durableId="2C9B8093" w16cex:dateUtc="2025-10-16T03:32:00Z"/>
-  <w16cex:commentExtensible w16cex:durableId="2C9B81A4" w16cex:dateUtc="2025-10-16T03:37:00Z"/>
-  <w16cex:commentExtensible w16cex:durableId="2C9B81BF" w16cex:dateUtc="2025-10-16T03:37:00Z"/>
-  <w16cex:commentExtensible w16cex:durableId="2C9B81D1" w16cex:dateUtc="2025-10-16T03:38:00Z"/>
-  <w16cex:commentExtensible w16cex:durableId="2C601C9F" w16cex:dateUtc="2025-09-01T03:22:00Z"/>
-  <w16cex:commentExtensible w16cex:durableId="2C5BEF84" w16cex:dateUtc="2025-08-28T23:21:00Z"/>
-  <w16cex:commentExtensible w16cex:durableId="5B0843BA" w16cex:dateUtc="2025-09-05T01:28:00Z"/>
-  <w16cex:commentExtensible w16cex:durableId="2C9B82E9" w16cex:dateUtc="2025-10-16T03:42:00Z"/>
-  <w16cex:commentExtensible w16cex:durableId="2C9B850C" w16cex:dateUtc="2025-10-16T03:51:00Z"/>
-  <w16cex:commentExtensible w16cex:durableId="238B14A3" w16cex:dateUtc="2025-09-05T00:05:00Z"/>
-  <w16cex:commentExtensible w16cex:durableId="2C690EF4" w16cex:dateUtc="2025-09-07T22:14:00Z"/>
-  <w16cex:commentExtensible w16cex:durableId="2C9B8544" w16cex:dateUtc="2025-10-16T03:52:00Z"/>
-  <w16cex:commentExtensible w16cex:durableId="2C6D4E54" w16cex:dateUtc="2025-09-11T03:34:00Z"/>
-  <w16cex:commentExtensible w16cex:durableId="2C9B8571" w16cex:dateUtc="2025-10-16T03:53:00Z"/>
+<w16cex:commentsExtensible xmlns:wpc="http://schemas.microsoft.com/office/word/2010/wordprocessingCanvas" xmlns:cx="http://schemas.microsoft.com/office/drawing/2014/chartex" xmlns:cx1="http://schemas.microsoft.com/office/drawing/2015/9/8/chartex" xmlns:cx2="http://schemas.microsoft.com/office/drawing/2015/10/21/chartex" xmlns:cx3="http://schemas.microsoft.com/office/drawing/2016/5/9/chartex" xmlns:cx4="http://schemas.microsoft.com/office/drawing/2016/5/10/chartex" xmlns:cx5="http://schemas.microsoft.com/office/drawing/2016/5/11/chartex" xmlns:cx6="http://schemas.microsoft.com/office/drawing/2016/5/12/chartex" xmlns:cx7="http://schemas.microsoft.com/office/drawing/2016/5/13/chartex" xmlns:cx8="http://schemas.microsoft.com/office/drawing/2016/5/14/chartex" xmlns:cr="http://schemas.microsoft.com/office/comments/2020/reactions" xmlns:mc="http://schemas.openxmlformats.org/markup-compatibility/2006" xmlns:aink="http://schemas.microsoft.com/office/drawing/2016/ink" xmlns:am3d="http://schemas.microsoft.com/office/drawing/2017/model3d" xmlns:o="urn:schemas-microsoft-com:office:office" xmlns:oel="http://schemas.microsoft.com/office/2019/extlst" xmlns:r="http://schemas.openxmlformats.org/officeDocument/2006/relationships" xmlns:m="http://schemas.openxmlformats.org/officeDocument/2006/math" xmlns:v="urn:schemas-microsoft-com:vml" xmlns:wp14="http://schemas.microsoft.com/office/word/2010/wordprocessingDrawing" xmlns:wp="http://schemas.openxmlformats.org/drawingml/2006/wordprocessingDrawing" xmlns:w10="urn:schemas-microsoft-com:office:word" xmlns:w="http://schemas.openxmlformats.org/wordprocessingml/2006/main" xmlns:w14="http://schemas.microsoft.com/office/word/2010/wordml" xmlns:w15="http://schemas.microsoft.com/office/word/2012/wordml" xmlns:w16cex="http://schemas.microsoft.com/office/word/2018/wordml/cex" xmlns:w16cid="http://schemas.microsoft.com/office/word/2016/wordml/cid" xmlns:w16="http://schemas.microsoft.com/office/word/2018/wordml" xmlns:w16du="http://schemas.microsoft.com/office/word/2023/wordml/word16du" xmlns:w16sdtdh="http://schemas.microsoft.com/office/word/2020/wordml/sdtdatahash" xmlns:w16sdtfl="http://schemas.microsoft.com/office/word/2024/wordml/sdtformatlock" xmlns:w16se="http://schemas.microsoft.com/office/word/2015/wordml/symex" xmlns:wpg="http://schemas.microsoft.com/office/word/2010/wordprocessingGroup" xmlns:wpi="http://schemas.microsoft.com/office/word/2010/wordprocessingInk" xmlns:wne="http://schemas.microsoft.com/office/word/2006/wordml" xmlns:wps="http://schemas.microsoft.com/office/word/2010/wordprocessingShape" mc:Ignorable="w14 w15 w16se w16cid w16 w16cex w16sdtdh w16sdtfl cr w16du wp14">
+  <w16cex:commentExtensible w16cex:durableId="2A9CD5D0" w16cex:dateUtc="2025-10-28T16:13:00Z"/>
   <w16cex:commentExtensible w16cex:durableId="2C6D4E9E" w16cex:dateUtc="2025-09-11T03:35:00Z"/>
   <w16cex:commentExtensible w16cex:durableId="2C9B85B4" w16cex:dateUtc="2025-10-16T03:54:00Z"/>
   <w16cex:commentExtensible w16cex:durableId="2C695826" w16cex:dateUtc="2025-09-08T03:27:00Z"/>
   <w16cex:commentExtensible w16cex:durableId="2C6957D7" w16cex:dateUtc="2025-09-08T03:25:00Z"/>
+  <w16cex:commentExtensible w16cex:durableId="7A10A6FD" w16cex:dateUtc="2025-10-28T16:15:00Z"/>
   <w16cex:commentExtensible w16cex:durableId="66CC427A" w16cex:dateUtc="2025-09-05T03:43:00Z"/>
-  <w16cex:commentExtensible w16cex:durableId="2C9B85D0" w16cex:dateUtc="2025-10-16T03:55:00Z"/>
-  <w16cex:commentExtensible w16cex:durableId="4274D9B6" w16cex:dateUtc="2025-09-05T00:40:00Z"/>
-  <w16cex:commentExtensible w16cex:durableId="2C9B86FF" w16cex:dateUtc="2025-10-16T04:00:00Z"/>
-  <w16cex:commentExtensible w16cex:durableId="2C9B87CA" w16cex:dateUtc="2025-10-16T04:03:00Z"/>
-  <w16cex:commentExtensible w16cex:durableId="2C692046" w16cex:dateUtc="2025-09-07T23:28:00Z"/>
   <w16cex:commentExtensible w16cex:durableId="2C693048" w16cex:dateUtc="2025-09-08T00:36:00Z"/>
-  <w16cex:commentExtensible w16cex:durableId="2C9B8719" w16cex:dateUtc="2025-10-16T04:00:00Z"/>
-  <w16cex:commentExtensible w16cex:durableId="2C9B8766" w16cex:dateUtc="2025-10-16T04:01:00Z"/>
-  <w16cex:commentExtensible w16cex:durableId="10A0868D" w16cex:dateUtc="2025-09-05T00:54:00Z"/>
-  <w16cex:commentExtensible w16cex:durableId="2C6920F3" w16cex:dateUtc="2025-09-07T23:31:00Z"/>
-  <w16cex:commentExtensible w16cex:durableId="610BC6CB" w16cex:dateUtc="2025-09-05T01:03:00Z"/>
-  <w16cex:commentExtensible w16cex:durableId="132F2860" w16cex:dateUtc="2025-09-05T01:04:00Z"/>
-  <w16cex:commentExtensible w16cex:durableId="2C6921BF" w16cex:dateUtc="2025-09-07T23:34:00Z"/>
   <w16cex:commentExtensible w16cex:durableId="2C6D5124" w16cex:dateUtc="2025-09-11T03:46:00Z"/>
-  <w16cex:commentExtensible w16cex:durableId="1F6FC830" w16cex:dateUtc="2025-09-05T01:07:00Z"/>
-  <w16cex:commentExtensible w16cex:durableId="2C6931CD" w16cex:dateUtc="2025-09-08T00:43:00Z"/>
-  <w16cex:commentExtensible w16cex:durableId="2C9B88BE" w16cex:dateUtc="2025-10-16T04:07:00Z"/>
-  <w16cex:commentExtensible w16cex:durableId="726A3809" w16cex:dateUtc="2025-07-18T00:19:00Z"/>
-  <w16cex:commentExtensible w16cex:durableId="5C19B0F3" w16cex:dateUtc="2025-07-18T00:19:00Z"/>
 </w16cex:commentsExtensible>
 </file>
 
 <file path=word/commentsIds.xml><?xml version="1.0" encoding="utf-8"?>
-<w16cid:commentsIds xmlns:wpc="http://schemas.microsoft.com/office/word/2010/wordprocessingCanvas" xmlns:cx="http://schemas.microsoft.com/office/drawing/2014/chartex" xmlns:cx1="http://schemas.microsoft.com/office/drawing/2015/9/8/chartex" xmlns:cx2="http://schemas.microsoft.com/office/drawing/2015/10/21/chartex" xmlns:cx3="http://schemas.microsoft.com/office/drawing/2016/5/9/chartex" xmlns:cx4="http://schemas.microsoft.com/office/drawing/2016/5/10/chartex" xmlns:cx5="http://schemas.microsoft.com/office/drawing/2016/5/11/chartex" xmlns:cx6="http://schemas.microsoft.com/office/drawing/2016/5/12/chartex" xmlns:cx7="http://schemas.microsoft.com/office/drawing/2016/5/13/chartex" xmlns:cx8="http://schemas.microsoft.com/office/drawing/2016/5/14/chartex" xmlns:mc="http://schemas.openxmlformats.org/markup-compatibility/2006" xmlns:aink="http://schemas.microsoft.com/office/drawing/2016/ink" xmlns:am3d="http://schemas.microsoft.com/office/drawing/2017/model3d" xmlns:o="urn:schemas-microsoft-com:office:office" xmlns:r="http://schemas.openxmlformats.org/officeDocument/2006/relationships" xmlns:m="http://schemas.openxmlformats.org/officeDocument/2006/math" xmlns:v="urn:schemas-microsoft-com:vml" xmlns:wp14="http://schemas.microsoft.com/office/word/2010/wordprocessingDrawing" xmlns:wp="http://schemas.openxmlformats.org/drawingml/2006/wordprocessingDrawing" xmlns:w10="urn:schemas-microsoft-com:office:word" xmlns:w="http://schemas.openxmlformats.org/wordprocessingml/2006/main" xmlns:w14="http://schemas.microsoft.com/office/word/2010/wordml" xmlns:w15="http://schemas.microsoft.com/office/word/2012/wordml" xmlns:w16cid="http://schemas.microsoft.com/office/word/2016/wordml/cid" xmlns:w16se="http://schemas.microsoft.com/office/word/2015/wordml/symex" xmlns:wpg="http://schemas.microsoft.com/office/word/2010/wordprocessingGroup" xmlns:wpi="http://schemas.microsoft.com/office/word/2010/wordprocessingInk" xmlns:wne="http://schemas.microsoft.com/office/word/2006/wordml" xmlns:wps="http://schemas.microsoft.com/office/word/2010/wordprocessingShape" mc:Ignorable="w14 w15 w16se w16cid wp14">
+<w16cid:commentsIds xmlns:wpc="http://schemas.microsoft.com/office/word/2010/wordprocessingCanvas" xmlns:cx="http://schemas.microsoft.com/office/drawing/2014/chartex" xmlns:cx1="http://schemas.microsoft.com/office/drawing/2015/9/8/chartex" xmlns:cx2="http://schemas.microsoft.com/office/drawing/2015/10/21/chartex" xmlns:cx3="http://schemas.microsoft.com/office/drawing/2016/5/9/chartex" xmlns:cx4="http://schemas.microsoft.com/office/drawing/2016/5/10/chartex" xmlns:cx5="http://schemas.microsoft.com/office/drawing/2016/5/11/chartex" xmlns:cx6="http://schemas.microsoft.com/office/drawing/2016/5/12/chartex" xmlns:cx7="http://schemas.microsoft.com/office/drawing/2016/5/13/chartex" xmlns:cx8="http://schemas.microsoft.com/office/drawing/2016/5/14/chartex" xmlns:mc="http://schemas.openxmlformats.org/markup-compatibility/2006" xmlns:aink="http://schemas.microsoft.com/office/drawing/2016/ink" xmlns:am3d="http://schemas.microsoft.com/office/drawing/2017/model3d" xmlns:o="urn:schemas-microsoft-com:office:office" xmlns:oel="http://schemas.microsoft.com/office/2019/extlst" xmlns:r="http://schemas.openxmlformats.org/officeDocument/2006/relationships" xmlns:m="http://schemas.openxmlformats.org/officeDocument/2006/math" xmlns:v="urn:schemas-microsoft-com:vml" xmlns:wp14="http://schemas.microsoft.com/office/word/2010/wordprocessingDrawing" xmlns:wp="http://schemas.openxmlformats.org/drawingml/2006/wordprocessingDrawing" xmlns:w10="urn:schemas-microsoft-com:office:word" xmlns:w="http://schemas.openxmlformats.org/wordprocessingml/2006/main" xmlns:w14="http://schemas.microsoft.com/office/word/2010/wordml" xmlns:w15="http://schemas.microsoft.com/office/word/2012/wordml" xmlns:w16cex="http://schemas.microsoft.com/office/word/2018/wordml/cex" xmlns:w16cid="http://schemas.microsoft.com/office/word/2016/wordml/cid" xmlns:w16="http://schemas.microsoft.com/office/word/2018/wordml" xmlns:w16du="http://schemas.microsoft.com/office/word/2023/wordml/word16du" xmlns:w16sdtdh="http://schemas.microsoft.com/office/word/2020/wordml/sdtdatahash" xmlns:w16sdtfl="http://schemas.microsoft.com/office/word/2024/wordml/sdtformatlock" xmlns:w16se="http://schemas.microsoft.com/office/word/2015/wordml/symex" xmlns:wpg="http://schemas.microsoft.com/office/word/2010/wordprocessingGroup" xmlns:wpi="http://schemas.microsoft.com/office/word/2010/wordprocessingInk" xmlns:wne="http://schemas.microsoft.com/office/word/2006/wordml" xmlns:wps="http://schemas.microsoft.com/office/word/2010/wordprocessingShape" mc:Ignorable="w14 w15 w16se w16cid w16 w16cex w16sdtdh w16sdtfl w16du wp14">
   <w16cid:commentId w16cid:paraId="0804FAE7" w16cid:durableId="2CAA5F57"/>
   <w16cid:commentId w16cid:paraId="004DD2FA" w16cid:durableId="2CAA5D50"/>
-  <w16cid:commentId w16cid:paraId="40D530F5" w16cid:durableId="2CAA6139"/>
   <w16cid:commentId w16cid:paraId="408757E6" w16cid:durableId="2C9C9C7A"/>
   <w16cid:commentId w16cid:paraId="3A502656" w16cid:durableId="2C9C9CA4"/>
   <w16cid:commentId w16cid:paraId="760C4F60" w16cid:durableId="2C77C606"/>
+  <w16cid:commentId w16cid:paraId="25509415" w16cid:durableId="2A9CD5D0"/>
   <w16cid:commentId w16cid:paraId="0241FB2B" w16cid:durableId="2C77C6C3"/>
   <w16cid:commentId w16cid:paraId="1ED2D972" w16cid:durableId="2CAA6C5B"/>
   <w16cid:commentId w16cid:paraId="1BCE38EC" w16cid:durableId="2C6D4E9E"/>
@@ -8813,6 +8784,7 @@
   <w16cid:commentId w16cid:paraId="05544B25" w16cid:durableId="2CAA6C95"/>
   <w16cid:commentId w16cid:paraId="17D9EC1B" w16cid:durableId="2C695826"/>
   <w16cid:commentId w16cid:paraId="7C119C61" w16cid:durableId="2C6957D7"/>
+  <w16cid:commentId w16cid:paraId="1DB74010" w16cid:durableId="7A10A6FD"/>
   <w16cid:commentId w16cid:paraId="518F3B79" w16cid:durableId="2CAA6638"/>
   <w16cid:commentId w16cid:paraId="6C6C7483" w16cid:durableId="66CC427A"/>
   <w16cid:commentId w16cid:paraId="521F6C3D" w16cid:durableId="2C6323EF"/>
@@ -8825,13 +8797,11 @@
   <w16cid:commentId w16cid:paraId="15A20379" w16cid:durableId="2C6D5124"/>
   <w16cid:commentId w16cid:paraId="3B7D18C5" w16cid:durableId="2C62F0CB"/>
   <w16cid:commentId w16cid:paraId="492C0592" w16cid:durableId="2C62F92D"/>
-  <w16cid:commentId w16cid:paraId="748384F7" w16cid:durableId="726A3809"/>
-  <w16cid:commentId w16cid:paraId="46CB9953" w16cid:durableId="5C19B0F3"/>
 </w16cid:commentsIds>
 </file>
 
 <file path=word/numbering.xml><?xml version="1.0" encoding="utf-8"?>
-<w:numbering xmlns:wpc="http://schemas.microsoft.com/office/word/2010/wordprocessingCanvas" xmlns:cx="http://schemas.microsoft.com/office/drawing/2014/chartex" xmlns:cx1="http://schemas.microsoft.com/office/drawing/2015/9/8/chartex" xmlns:cx2="http://schemas.microsoft.com/office/drawing/2015/10/21/chartex" xmlns:cx3="http://schemas.microsoft.com/office/drawing/2016/5/9/chartex" xmlns:cx4="http://schemas.microsoft.com/office/drawing/2016/5/10/chartex" xmlns:cx5="http://schemas.microsoft.com/office/drawing/2016/5/11/chartex" xmlns:cx6="http://schemas.microsoft.com/office/drawing/2016/5/12/chartex" xmlns:cx7="http://schemas.microsoft.com/office/drawing/2016/5/13/chartex" xmlns:cx8="http://schemas.microsoft.com/office/drawing/2016/5/14/chartex" xmlns:mc="http://schemas.openxmlformats.org/markup-compatibility/2006" xmlns:aink="http://schemas.microsoft.com/office/drawing/2016/ink" xmlns:am3d="http://schemas.microsoft.com/office/drawing/2017/model3d" xmlns:o="urn:schemas-microsoft-com:office:office" xmlns:r="http://schemas.openxmlformats.org/officeDocument/2006/relationships" xmlns:m="http://schemas.openxmlformats.org/officeDocument/2006/math" xmlns:v="urn:schemas-microsoft-com:vml" xmlns:wp14="http://schemas.microsoft.com/office/word/2010/wordprocessingDrawing" xmlns:wp="http://schemas.openxmlformats.org/drawingml/2006/wordprocessingDrawing" xmlns:w10="urn:schemas-microsoft-com:office:word" xmlns:w="http://schemas.openxmlformats.org/wordprocessingml/2006/main" xmlns:w14="http://schemas.microsoft.com/office/word/2010/wordml" xmlns:w15="http://schemas.microsoft.com/office/word/2012/wordml" xmlns:w16cid="http://schemas.microsoft.com/office/word/2016/wordml/cid" xmlns:w16se="http://schemas.microsoft.com/office/word/2015/wordml/symex" xmlns:wpg="http://schemas.microsoft.com/office/word/2010/wordprocessingGroup" xmlns:wpi="http://schemas.microsoft.com/office/word/2010/wordprocessingInk" xmlns:wne="http://schemas.microsoft.com/office/word/2006/wordml" xmlns:wps="http://schemas.microsoft.com/office/word/2010/wordprocessingShape" mc:Ignorable="w14 w15 w16se w16cid wp14">
+<w:numbering xmlns:wpc="http://schemas.microsoft.com/office/word/2010/wordprocessingCanvas" xmlns:cx="http://schemas.microsoft.com/office/drawing/2014/chartex" xmlns:cx1="http://schemas.microsoft.com/office/drawing/2015/9/8/chartex" xmlns:cx2="http://schemas.microsoft.com/office/drawing/2015/10/21/chartex" xmlns:cx3="http://schemas.microsoft.com/office/drawing/2016/5/9/chartex" xmlns:cx4="http://schemas.microsoft.com/office/drawing/2016/5/10/chartex" xmlns:cx5="http://schemas.microsoft.com/office/drawing/2016/5/11/chartex" xmlns:cx6="http://schemas.microsoft.com/office/drawing/2016/5/12/chartex" xmlns:cx7="http://schemas.microsoft.com/office/drawing/2016/5/13/chartex" xmlns:cx8="http://schemas.microsoft.com/office/drawing/2016/5/14/chartex" xmlns:mc="http://schemas.openxmlformats.org/markup-compatibility/2006" xmlns:aink="http://schemas.microsoft.com/office/drawing/2016/ink" xmlns:am3d="http://schemas.microsoft.com/office/drawing/2017/model3d" xmlns:o="urn:schemas-microsoft-com:office:office" xmlns:oel="http://schemas.microsoft.com/office/2019/extlst" xmlns:r="http://schemas.openxmlformats.org/officeDocument/2006/relationships" xmlns:m="http://schemas.openxmlformats.org/officeDocument/2006/math" xmlns:v="urn:schemas-microsoft-com:vml" xmlns:wp14="http://schemas.microsoft.com/office/word/2010/wordprocessingDrawing" xmlns:wp="http://schemas.openxmlformats.org/drawingml/2006/wordprocessingDrawing" xmlns:w10="urn:schemas-microsoft-com:office:word" xmlns:w="http://schemas.openxmlformats.org/wordprocessingml/2006/main" xmlns:w14="http://schemas.microsoft.com/office/word/2010/wordml" xmlns:w15="http://schemas.microsoft.com/office/word/2012/wordml" xmlns:w16cex="http://schemas.microsoft.com/office/word/2018/wordml/cex" xmlns:w16cid="http://schemas.microsoft.com/office/word/2016/wordml/cid" xmlns:w16="http://schemas.microsoft.com/office/word/2018/wordml" xmlns:w16du="http://schemas.microsoft.com/office/word/2023/wordml/word16du" xmlns:w16sdtdh="http://schemas.microsoft.com/office/word/2020/wordml/sdtdatahash" xmlns:w16sdtfl="http://schemas.microsoft.com/office/word/2024/wordml/sdtformatlock" xmlns:w16se="http://schemas.microsoft.com/office/word/2015/wordml/symex" xmlns:wpg="http://schemas.microsoft.com/office/word/2010/wordprocessingGroup" xmlns:wpi="http://schemas.microsoft.com/office/word/2010/wordprocessingInk" xmlns:wne="http://schemas.microsoft.com/office/word/2006/wordml" xmlns:wps="http://schemas.microsoft.com/office/word/2010/wordprocessingShape" mc:Ignorable="w14 w15 w16se w16cid w16 w16cex w16sdtdh w16sdtfl w16du wp14">
   <w:abstractNum w:abstractNumId="0" w15:restartNumberingAfterBreak="0">
     <w:nsid w:val="029E103F"/>
     <w:multiLevelType w:val="hybridMultilevel"/>
@@ -10929,70 +10899,73 @@
       </w:rPr>
     </w:lvl>
   </w:abstractNum>
-  <w:num w:numId="1">
+  <w:num w:numId="1" w16cid:durableId="824199568">
     <w:abstractNumId w:val="17"/>
   </w:num>
-  <w:num w:numId="2">
+  <w:num w:numId="2" w16cid:durableId="1094739224">
     <w:abstractNumId w:val="4"/>
   </w:num>
-  <w:num w:numId="3">
+  <w:num w:numId="3" w16cid:durableId="804742553">
     <w:abstractNumId w:val="3"/>
   </w:num>
-  <w:num w:numId="4">
+  <w:num w:numId="4" w16cid:durableId="1540167811">
     <w:abstractNumId w:val="18"/>
   </w:num>
-  <w:num w:numId="5">
+  <w:num w:numId="5" w16cid:durableId="265574806">
     <w:abstractNumId w:val="15"/>
   </w:num>
-  <w:num w:numId="6">
+  <w:num w:numId="6" w16cid:durableId="1721661227">
     <w:abstractNumId w:val="11"/>
   </w:num>
-  <w:num w:numId="7">
+  <w:num w:numId="7" w16cid:durableId="1128016255">
     <w:abstractNumId w:val="8"/>
   </w:num>
-  <w:num w:numId="8">
+  <w:num w:numId="8" w16cid:durableId="748311878">
     <w:abstractNumId w:val="7"/>
   </w:num>
-  <w:num w:numId="9">
+  <w:num w:numId="9" w16cid:durableId="799224854">
     <w:abstractNumId w:val="9"/>
   </w:num>
-  <w:num w:numId="10">
+  <w:num w:numId="10" w16cid:durableId="1848976829">
     <w:abstractNumId w:val="16"/>
   </w:num>
-  <w:num w:numId="11">
+  <w:num w:numId="11" w16cid:durableId="1718165678">
     <w:abstractNumId w:val="10"/>
   </w:num>
-  <w:num w:numId="12">
+  <w:num w:numId="12" w16cid:durableId="1570535369">
     <w:abstractNumId w:val="5"/>
   </w:num>
-  <w:num w:numId="13">
+  <w:num w:numId="13" w16cid:durableId="458914546">
     <w:abstractNumId w:val="12"/>
   </w:num>
-  <w:num w:numId="14">
+  <w:num w:numId="14" w16cid:durableId="675033816">
     <w:abstractNumId w:val="14"/>
   </w:num>
-  <w:num w:numId="15">
+  <w:num w:numId="15" w16cid:durableId="1716078761">
     <w:abstractNumId w:val="2"/>
   </w:num>
-  <w:num w:numId="16">
+  <w:num w:numId="16" w16cid:durableId="1586037936">
     <w:abstractNumId w:val="13"/>
   </w:num>
-  <w:num w:numId="17">
+  <w:num w:numId="17" w16cid:durableId="249430965">
     <w:abstractNumId w:val="0"/>
   </w:num>
-  <w:num w:numId="18">
+  <w:num w:numId="18" w16cid:durableId="1856846894">
     <w:abstractNumId w:val="6"/>
   </w:num>
-  <w:num w:numId="19">
+  <w:num w:numId="19" w16cid:durableId="263731897">
     <w:abstractNumId w:val="1"/>
   </w:num>
 </w:numbering>
 </file>
 
 <file path=word/people.xml><?xml version="1.0" encoding="utf-8"?>
-<w15:people xmlns:wpc="http://schemas.microsoft.com/office/word/2010/wordprocessingCanvas" xmlns:cx="http://schemas.microsoft.com/office/drawing/2014/chartex" xmlns:cx1="http://schemas.microsoft.com/office/drawing/2015/9/8/chartex" xmlns:cx2="http://schemas.microsoft.com/office/drawing/2015/10/21/chartex" xmlns:cx3="http://schemas.microsoft.com/office/drawing/2016/5/9/chartex" xmlns:cx4="http://schemas.microsoft.com/office/drawing/2016/5/10/chartex" xmlns:cx5="http://schemas.microsoft.com/office/drawing/2016/5/11/chartex" xmlns:cx6="http://schemas.microsoft.com/office/drawing/2016/5/12/chartex" xmlns:cx7="http://schemas.microsoft.com/office/drawing/2016/5/13/chartex" xmlns:cx8="http://schemas.microsoft.com/office/drawing/2016/5/14/chartex" xmlns:mc="http://schemas.openxmlformats.org/markup-compatibility/2006" xmlns:aink="http://schemas.microsoft.com/office/drawing/2016/ink" xmlns:am3d="http://schemas.microsoft.com/office/drawing/2017/model3d" xmlns:o="urn:schemas-microsoft-com:office:office" xmlns:r="http://schemas.openxmlformats.org/officeDocument/2006/relationships" xmlns:m="http://schemas.openxmlformats.org/officeDocument/2006/math" xmlns:v="urn:schemas-microsoft-com:vml" xmlns:wp14="http://schemas.microsoft.com/office/word/2010/wordprocessingDrawing" xmlns:wp="http://schemas.openxmlformats.org/drawingml/2006/wordprocessingDrawing" xmlns:w10="urn:schemas-microsoft-com:office:word" xmlns:w="http://schemas.openxmlformats.org/wordprocessingml/2006/main" xmlns:w14="http://schemas.microsoft.com/office/word/2010/wordml" xmlns:w15="http://schemas.microsoft.com/office/word/2012/wordml" xmlns:w16cid="http://schemas.microsoft.com/office/word/2016/wordml/cid" xmlns:w16se="http://schemas.microsoft.com/office/word/2015/wordml/symex" xmlns:wpg="http://schemas.microsoft.com/office/word/2010/wordprocessingGroup" xmlns:wpi="http://schemas.microsoft.com/office/word/2010/wordprocessingInk" xmlns:wne="http://schemas.microsoft.com/office/word/2006/wordml" xmlns:wps="http://schemas.microsoft.com/office/word/2010/wordprocessingShape" mc:Ignorable="w14 w15 w16se w16cid wp14">
+<w15:people xmlns:wpc="http://schemas.microsoft.com/office/word/2010/wordprocessingCanvas" xmlns:cx="http://schemas.microsoft.com/office/drawing/2014/chartex" xmlns:cx1="http://schemas.microsoft.com/office/drawing/2015/9/8/chartex" xmlns:cx2="http://schemas.microsoft.com/office/drawing/2015/10/21/chartex" xmlns:cx3="http://schemas.microsoft.com/office/drawing/2016/5/9/chartex" xmlns:cx4="http://schemas.microsoft.com/office/drawing/2016/5/10/chartex" xmlns:cx5="http://schemas.microsoft.com/office/drawing/2016/5/11/chartex" xmlns:cx6="http://schemas.microsoft.com/office/drawing/2016/5/12/chartex" xmlns:cx7="http://schemas.microsoft.com/office/drawing/2016/5/13/chartex" xmlns:cx8="http://schemas.microsoft.com/office/drawing/2016/5/14/chartex" xmlns:mc="http://schemas.openxmlformats.org/markup-compatibility/2006" xmlns:aink="http://schemas.microsoft.com/office/drawing/2016/ink" xmlns:am3d="http://schemas.microsoft.com/office/drawing/2017/model3d" xmlns:o="urn:schemas-microsoft-com:office:office" xmlns:oel="http://schemas.microsoft.com/office/2019/extlst" xmlns:r="http://schemas.openxmlformats.org/officeDocument/2006/relationships" xmlns:m="http://schemas.openxmlformats.org/officeDocument/2006/math" xmlns:v="urn:schemas-microsoft-com:vml" xmlns:wp14="http://schemas.microsoft.com/office/word/2010/wordprocessingDrawing" xmlns:wp="http://schemas.openxmlformats.org/drawingml/2006/wordprocessingDrawing" xmlns:w10="urn:schemas-microsoft-com:office:word" xmlns:w="http://schemas.openxmlformats.org/wordprocessingml/2006/main" xmlns:w14="http://schemas.microsoft.com/office/word/2010/wordml" xmlns:w15="http://schemas.microsoft.com/office/word/2012/wordml" xmlns:w16cex="http://schemas.microsoft.com/office/word/2018/wordml/cex" xmlns:w16cid="http://schemas.microsoft.com/office/word/2016/wordml/cid" xmlns:w16="http://schemas.microsoft.com/office/word/2018/wordml" xmlns:w16du="http://schemas.microsoft.com/office/word/2023/wordml/word16du" xmlns:w16sdtdh="http://schemas.microsoft.com/office/word/2020/wordml/sdtdatahash" xmlns:w16sdtfl="http://schemas.microsoft.com/office/word/2024/wordml/sdtformatlock" xmlns:w16se="http://schemas.microsoft.com/office/word/2015/wordml/symex" xmlns:wpg="http://schemas.microsoft.com/office/word/2010/wordprocessingGroup" xmlns:wpi="http://schemas.microsoft.com/office/word/2010/wordprocessingInk" xmlns:wne="http://schemas.microsoft.com/office/word/2006/wordml" xmlns:wps="http://schemas.microsoft.com/office/word/2010/wordprocessingShape" mc:Ignorable="w14 w15 w16se w16cid w16 w16cex w16sdtdh w16sdtfl w16du wp14">
   <w15:person w15:author="Microsoft Office User">
     <w15:presenceInfo w15:providerId="None" w15:userId="Microsoft Office User"/>
+  </w15:person>
+  <w15:person w15:author="Kyle Ewart">
+    <w15:presenceInfo w15:providerId="None" w15:userId="Kyle Ewart"/>
   </w15:person>
   <w15:person w15:author="Nathan Lo">
     <w15:presenceInfo w15:providerId="AD" w15:userId="S::nathan.lo@sydney.edu.au::fa283856-3d32-4c02-b0bb-860e4dd4c232"/>
@@ -11004,7 +10977,7 @@
 </file>
 
 <file path=word/styles.xml><?xml version="1.0" encoding="utf-8"?>
-<w:styles xmlns:mc="http://schemas.openxmlformats.org/markup-compatibility/2006" xmlns:r="http://schemas.openxmlformats.org/officeDocument/2006/relationships" xmlns:w="http://schemas.openxmlformats.org/wordprocessingml/2006/main" xmlns:w14="http://schemas.microsoft.com/office/word/2010/wordml" xmlns:w15="http://schemas.microsoft.com/office/word/2012/wordml" xmlns:w16cid="http://schemas.microsoft.com/office/word/2016/wordml/cid" xmlns:w16se="http://schemas.microsoft.com/office/word/2015/wordml/symex" mc:Ignorable="w14 w15 w16se w16cid">
+<w:styles xmlns:mc="http://schemas.openxmlformats.org/markup-compatibility/2006" xmlns:r="http://schemas.openxmlformats.org/officeDocument/2006/relationships" xmlns:w="http://schemas.openxmlformats.org/wordprocessingml/2006/main" xmlns:w14="http://schemas.microsoft.com/office/word/2010/wordml" xmlns:w15="http://schemas.microsoft.com/office/word/2012/wordml" xmlns:w16cex="http://schemas.microsoft.com/office/word/2018/wordml/cex" xmlns:w16cid="http://schemas.microsoft.com/office/word/2016/wordml/cid" xmlns:w16="http://schemas.microsoft.com/office/word/2018/wordml" xmlns:w16du="http://schemas.microsoft.com/office/word/2023/wordml/word16du" xmlns:w16sdtdh="http://schemas.microsoft.com/office/word/2020/wordml/sdtdatahash" xmlns:w16sdtfl="http://schemas.microsoft.com/office/word/2024/wordml/sdtformatlock" xmlns:w16se="http://schemas.microsoft.com/office/word/2015/wordml/symex" mc:Ignorable="w14 w15 w16se w16cid w16 w16cex w16sdtdh w16sdtfl w16du">
   <w:docDefaults>
     <w:rPrDefault>
       <w:rPr>
@@ -11018,7 +10991,7 @@
     </w:rPrDefault>
     <w:pPrDefault/>
   </w:docDefaults>
-  <w:latentStyles w:defLockedState="0" w:defUIPriority="99" w:defSemiHidden="0" w:defUnhideWhenUsed="0" w:defQFormat="0" w:count="375">
+  <w:latentStyles w:defLockedState="0" w:defUIPriority="99" w:defSemiHidden="0" w:defUnhideWhenUsed="0" w:defQFormat="0" w:count="376">
     <w:lsdException w:name="Normal" w:uiPriority="0" w:qFormat="1"/>
     <w:lsdException w:name="heading 1" w:uiPriority="9" w:qFormat="1"/>
     <w:lsdException w:name="heading 2" w:semiHidden="1" w:uiPriority="9" w:unhideWhenUsed="1" w:qFormat="1"/>
@@ -11394,6 +11367,7 @@
     <w:lsdException w:name="Smart Hyperlink" w:semiHidden="1" w:unhideWhenUsed="1"/>
     <w:lsdException w:name="Hashtag" w:semiHidden="1" w:unhideWhenUsed="1"/>
     <w:lsdException w:name="Unresolved Mention" w:semiHidden="1" w:unhideWhenUsed="1"/>
+    <w:lsdException w:name="Smart Link" w:semiHidden="1" w:unhideWhenUsed="1"/>
   </w:latentStyles>
   <w:style w:type="paragraph" w:default="1" w:styleId="Normal">
     <w:name w:val="Normal"/>
@@ -11599,7 +11573,6 @@
   <w:style w:type="character" w:default="1" w:styleId="DefaultParagraphFont">
     <w:name w:val="Default Paragraph Font"/>
     <w:uiPriority w:val="1"/>
-    <w:semiHidden/>
     <w:unhideWhenUsed/>
   </w:style>
   <w:style w:type="table" w:default="1" w:styleId="TableNormal">

</xml_diff>